<commit_message>
Updated Retriever in the document.
</commit_message>
<xml_diff>
--- a/swarmmate_audit_workpaper_adapter/swarmmate_audit_workpaper_adapter/SwarmMate_Audit_Workpaper_Adapter_Certification_Challenge_Draft.docx.docx
+++ b/swarmmate_audit_workpaper_adapter/swarmmate_audit_workpaper_adapter/SwarmMate_Audit_Workpaper_Adapter_Certification_Challenge_Draft.docx.docx
@@ -1487,150 +1487,90 @@
     </w:p>
     <w:p>
       <w:r>
-        <w:t>Planned retriever improvement</w:t>
-      </w:r>
-    </w:p>
-    <w:p>
-      <w:r>
-        <w:t>After establishing the baseline, the retriever will be upgraded by improving one or more of the following:</w:t>
-      </w:r>
-    </w:p>
-    <w:p>
-      <w:pPr>
-        <w:pStyle w:val="ListParagraph"/>
-        <w:numPr>
-          <w:ilvl w:val="0"/>
-          <w:numId w:val="12"/>
-        </w:numPr>
-      </w:pPr>
-      <w:r>
-        <w:t>better chunking strategy,</w:t>
-      </w:r>
-    </w:p>
-    <w:p>
-      <w:pPr>
-        <w:pStyle w:val="ListParagraph"/>
-        <w:numPr>
-          <w:ilvl w:val="0"/>
-          <w:numId w:val="12"/>
-        </w:numPr>
-      </w:pPr>
-      <w:r>
-        <w:t>revised chunk size / overlap,</w:t>
-      </w:r>
-    </w:p>
-    <w:p>
-      <w:pPr>
-        <w:pStyle w:val="ListParagraph"/>
-        <w:numPr>
-          <w:ilvl w:val="0"/>
-          <w:numId w:val="12"/>
-        </w:numPr>
-      </w:pPr>
-      <w:r>
-        <w:t>tuned top-k retrieval,</w:t>
-      </w:r>
-    </w:p>
-    <w:p>
-      <w:pPr>
-        <w:pStyle w:val="ListParagraph"/>
-        <w:numPr>
-          <w:ilvl w:val="0"/>
-          <w:numId w:val="12"/>
-        </w:numPr>
-      </w:pPr>
-      <w:r>
-        <w:t>query rewriting or multiple retrieval queries,</w:t>
-      </w:r>
-    </w:p>
-    <w:p>
-      <w:pPr>
-        <w:pStyle w:val="ListParagraph"/>
-        <w:numPr>
-          <w:ilvl w:val="0"/>
-          <w:numId w:val="12"/>
-        </w:numPr>
-      </w:pPr>
-      <w:r>
-        <w:t>reranking of retrieved chunks.</w:t>
-      </w:r>
-    </w:p>
-    <w:p>
-      <w:r>
-        <w:t>What will be compared</w:t>
-      </w:r>
-    </w:p>
-    <w:p>
-      <w:pPr>
-        <w:pStyle w:val="ListParagraph"/>
-        <w:numPr>
-          <w:ilvl w:val="0"/>
-          <w:numId w:val="13"/>
-        </w:numPr>
-      </w:pPr>
-      <w:r>
-        <w:t>The before/after comparison should measure whether the upgraded retriever:</w:t>
-      </w:r>
-    </w:p>
-    <w:p>
-      <w:pPr>
-        <w:pStyle w:val="ListParagraph"/>
-        <w:numPr>
-          <w:ilvl w:val="0"/>
-          <w:numId w:val="13"/>
-        </w:numPr>
-      </w:pPr>
-      <w:r>
-        <w:t>improves citation quality,</w:t>
-      </w:r>
-    </w:p>
-    <w:p>
-      <w:pPr>
-        <w:pStyle w:val="ListParagraph"/>
-        <w:numPr>
-          <w:ilvl w:val="0"/>
-          <w:numId w:val="13"/>
-        </w:numPr>
-      </w:pPr>
-      <w:r>
-        <w:t>reduces irrelevant context,</w:t>
-      </w:r>
-    </w:p>
-    <w:p>
-      <w:pPr>
-        <w:pStyle w:val="ListParagraph"/>
-        <w:numPr>
-          <w:ilvl w:val="0"/>
-          <w:numId w:val="13"/>
-        </w:numPr>
-      </w:pPr>
-      <w:proofErr w:type="gramStart"/>
-      <w:r>
-        <w:t>increases</w:t>
-      </w:r>
-      <w:proofErr w:type="gramEnd"/>
-      <w:r>
-        <w:t xml:space="preserve"> </w:t>
+        <w:t xml:space="preserve"> The baseline retriever was already strong, with perfect context precision and high average recall. However, one synthesis-heavy prompt scored lower on recall, suggesting some supporting evidence was </w:t>
+      </w:r>
+      <w:r>
+        <w:t>missing</w:t>
+      </w:r>
+      <w:r>
+        <w:t>. To address this, I tested a lightweight retriever upgrade aimed at improving coverage for multi-source audit questions. The upgrade produced only modest gains, which indicates that the baseline retriever is already a strong fit for this MVP. For this reason, I would keep the simpler baseline configuration for now and reserve more complex retrieval techniques for future iterations.</w:t>
+      </w:r>
+    </w:p>
+    <w:p>
+      <w:pPr>
+        <w:rPr>
+          <w:b/>
+          <w:bCs/>
+        </w:rPr>
+      </w:pPr>
+    </w:p>
+    <w:p>
+      <w:pPr>
+        <w:rPr>
+          <w:b/>
+          <w:bCs/>
+        </w:rPr>
+      </w:pPr>
+      <w:r>
+        <w:rPr>
+          <w:b/>
+          <w:bCs/>
+        </w:rPr>
+        <w:t>7. Next Steps</w:t>
+      </w:r>
+    </w:p>
+    <w:p>
+      <w:r>
+        <w:t>Toward a polished Demo Day version</w:t>
+      </w:r>
+    </w:p>
+    <w:p>
+      <w:r>
+        <w:t>The next steps for this project are:</w:t>
+      </w:r>
+    </w:p>
+    <w:p>
+      <w:r>
+        <w:t xml:space="preserve">1. polish the </w:t>
       </w:r>
       <w:proofErr w:type="spellStart"/>
       <w:r>
-        <w:t>groundedness</w:t>
+        <w:t>Gradio</w:t>
       </w:r>
       <w:proofErr w:type="spellEnd"/>
       <w:r>
-        <w:t>,</w:t>
-      </w:r>
-    </w:p>
-    <w:p>
-      <w:pPr>
-        <w:pStyle w:val="ListParagraph"/>
-        <w:numPr>
-          <w:ilvl w:val="0"/>
-          <w:numId w:val="13"/>
-        </w:numPr>
-      </w:pPr>
-      <w:r>
-        <w:t>produces better final artifacts.</w:t>
+        <w:t xml:space="preserve"> UI for a cleaner workflow-driven experience,</w:t>
+      </w:r>
+    </w:p>
+    <w:p>
+      <w:r>
+        <w:t>2. support file upload as the primary source-attachment flow,</w:t>
+      </w:r>
+    </w:p>
+    <w:p>
+      <w:r>
+        <w:t>3. make workflow selection explicit and controllable from the UI,</w:t>
+      </w:r>
+    </w:p>
+    <w:p>
+      <w:r>
+        <w:lastRenderedPageBreak/>
+        <w:t>4. add report export options beyond markdown,</w:t>
+      </w:r>
+    </w:p>
+    <w:p>
+      <w:r>
+        <w:t>5. improve retrieval evaluation and document traceability,</w:t>
+      </w:r>
+    </w:p>
+    <w:p>
+      <w:r>
+        <w:t>6. expand to additional workflow types such as client letters and issues checklists,</w:t>
+      </w:r>
+    </w:p>
+    <w:p>
+      <w:r>
+        <w:t>7. later explore connector-style or MCP-backed source integration.</w:t>
       </w:r>
     </w:p>
     <w:p/>
@@ -1646,229 +1586,11 @@
           <w:b/>
           <w:bCs/>
         </w:rPr>
-        <w:lastRenderedPageBreak/>
-        <w:t>Improved metrics + analysis</w:t>
-      </w:r>
-    </w:p>
-    <w:p>
-      <w:r>
-        <w:t>To be filled in after running the upgrade experiment.</w:t>
-      </w:r>
-    </w:p>
-    <w:p>
-      <w:r>
-        <w:t>The analysis section should explain:</w:t>
-      </w:r>
-    </w:p>
-    <w:p>
-      <w:pPr>
-        <w:pStyle w:val="ListParagraph"/>
-        <w:numPr>
-          <w:ilvl w:val="0"/>
-          <w:numId w:val="14"/>
-        </w:numPr>
-      </w:pPr>
-      <w:r>
-        <w:t xml:space="preserve">what </w:t>
-      </w:r>
-      <w:proofErr w:type="gramStart"/>
-      <w:r>
-        <w:t>was</w:t>
-      </w:r>
-      <w:proofErr w:type="gramEnd"/>
-      <w:r>
-        <w:t xml:space="preserve"> changed,</w:t>
-      </w:r>
-    </w:p>
-    <w:p>
-      <w:pPr>
-        <w:pStyle w:val="ListParagraph"/>
-        <w:numPr>
-          <w:ilvl w:val="0"/>
-          <w:numId w:val="14"/>
-        </w:numPr>
-      </w:pPr>
-      <w:proofErr w:type="gramStart"/>
-      <w:r>
-        <w:t>why</w:t>
-      </w:r>
-      <w:proofErr w:type="gramEnd"/>
-      <w:r>
-        <w:t xml:space="preserve"> </w:t>
-      </w:r>
-      <w:proofErr w:type="gramStart"/>
-      <w:r>
-        <w:t>it was changed,</w:t>
-      </w:r>
-      <w:proofErr w:type="gramEnd"/>
-    </w:p>
-    <w:p>
-      <w:pPr>
-        <w:pStyle w:val="ListParagraph"/>
-        <w:numPr>
-          <w:ilvl w:val="0"/>
-          <w:numId w:val="14"/>
-        </w:numPr>
-      </w:pPr>
-      <w:r>
-        <w:t>how the metrics shifted,</w:t>
-      </w:r>
-    </w:p>
-    <w:p>
-      <w:pPr>
-        <w:pStyle w:val="ListParagraph"/>
-        <w:numPr>
-          <w:ilvl w:val="0"/>
-          <w:numId w:val="14"/>
-        </w:numPr>
-      </w:pPr>
-      <w:r>
-        <w:t>whether the extra complexity is worth it.</w:t>
-      </w:r>
-    </w:p>
-    <w:p>
-      <w:pPr>
-        <w:rPr>
-          <w:b/>
-          <w:bCs/>
-        </w:rPr>
-      </w:pPr>
-    </w:p>
-    <w:p>
-      <w:pPr>
-        <w:rPr>
-          <w:b/>
-          <w:bCs/>
-        </w:rPr>
-      </w:pPr>
-    </w:p>
-    <w:p>
-      <w:pPr>
-        <w:rPr>
-          <w:b/>
-          <w:bCs/>
-        </w:rPr>
-      </w:pPr>
-    </w:p>
-    <w:p>
-      <w:pPr>
-        <w:rPr>
-          <w:b/>
-          <w:bCs/>
-        </w:rPr>
-      </w:pPr>
-    </w:p>
-    <w:p>
-      <w:pPr>
-        <w:rPr>
-          <w:b/>
-          <w:bCs/>
-        </w:rPr>
-      </w:pPr>
-    </w:p>
-    <w:p>
-      <w:pPr>
-        <w:rPr>
-          <w:b/>
-          <w:bCs/>
-        </w:rPr>
-      </w:pPr>
-    </w:p>
-    <w:p>
-      <w:pPr>
-        <w:rPr>
-          <w:b/>
-          <w:bCs/>
-        </w:rPr>
-      </w:pPr>
-    </w:p>
-    <w:p>
-      <w:pPr>
-        <w:rPr>
-          <w:b/>
-          <w:bCs/>
-        </w:rPr>
-      </w:pPr>
-      <w:r>
-        <w:rPr>
-          <w:b/>
-          <w:bCs/>
-        </w:rPr>
-        <w:t>7. Next Steps</w:t>
-      </w:r>
-    </w:p>
-    <w:p>
-      <w:r>
-        <w:t>Toward a polished Demo Day version</w:t>
-      </w:r>
-    </w:p>
-    <w:p>
-      <w:r>
-        <w:t>The next steps for this project are:</w:t>
-      </w:r>
-    </w:p>
-    <w:p>
-      <w:r>
-        <w:t xml:space="preserve">1. polish the </w:t>
-      </w:r>
-      <w:proofErr w:type="spellStart"/>
-      <w:r>
-        <w:t>Gradio</w:t>
-      </w:r>
-      <w:proofErr w:type="spellEnd"/>
-      <w:r>
-        <w:t xml:space="preserve"> UI for a cleaner workflow-driven experience,</w:t>
-      </w:r>
-    </w:p>
-    <w:p>
-      <w:r>
-        <w:t>2. support file upload as the primary source-attachment flow,</w:t>
-      </w:r>
-    </w:p>
-    <w:p>
-      <w:r>
-        <w:t>3. make workflow selection explicit and controllable from the UI,</w:t>
-      </w:r>
-    </w:p>
-    <w:p>
-      <w:r>
-        <w:t>4. add report export options beyond markdown,</w:t>
-      </w:r>
-    </w:p>
-    <w:p>
-      <w:r>
-        <w:t>5. improve retrieval evaluation and document traceability,</w:t>
-      </w:r>
-    </w:p>
-    <w:p>
-      <w:r>
-        <w:t>6. expand to additional workflow types such as client letters and issues checklists,</w:t>
-      </w:r>
-    </w:p>
-    <w:p>
-      <w:r>
-        <w:t>7. later explore connector-style or MCP-backed source integration.</w:t>
-      </w:r>
-    </w:p>
-    <w:p/>
-    <w:p>
-      <w:pPr>
-        <w:rPr>
-          <w:b/>
-          <w:bCs/>
-        </w:rPr>
-      </w:pPr>
-      <w:r>
-        <w:rPr>
-          <w:b/>
-          <w:bCs/>
-        </w:rPr>
         <w:t>Longer-term vision</w:t>
       </w:r>
     </w:p>
     <w:p>
       <w:r>
-        <w:lastRenderedPageBreak/>
         <w:t xml:space="preserve">The longer-term direction is to evolve </w:t>
       </w:r>
       <w:proofErr w:type="spellStart"/>

</xml_diff>

<commit_message>
Updating latest cocuments in repo.
</commit_message>
<xml_diff>
--- a/swarmmate_audit_workpaper_adapter/swarmmate_audit_workpaper_adapter/SwarmMate_Audit_Workpaper_Adapter_Certification_Challenge_Draft.docx.docx
+++ b/swarmmate_audit_workpaper_adapter/swarmmate_audit_workpaper_adapter/SwarmMate_Audit_Workpaper_Adapter_Certification_Challenge_Draft.docx.docx
@@ -349,6 +349,13 @@
           <w:b/>
           <w:bCs/>
         </w:rPr>
+        <w:t xml:space="preserve">a. </w:t>
+      </w:r>
+      <w:r>
+        <w:rPr>
+          <w:b/>
+          <w:bCs/>
+        </w:rPr>
         <w:t>Proposed system</w:t>
       </w:r>
     </w:p>
@@ -541,10 +548,322 @@
     <w:p/>
     <w:p/>
     <w:p/>
+    <w:p>
+      <w:pPr>
+        <w:rPr>
+          <w:b/>
+          <w:bCs/>
+        </w:rPr>
+      </w:pPr>
+      <w:r>
+        <w:rPr>
+          <w:b/>
+          <w:bCs/>
+        </w:rPr>
+        <w:lastRenderedPageBreak/>
+        <w:t xml:space="preserve">b. </w:t>
+      </w:r>
+      <w:r>
+        <w:rPr>
+          <w:b/>
+          <w:bCs/>
+        </w:rPr>
+        <w:t>Infrastructure Diagram of the Stack + Tooling Choices</w:t>
+      </w:r>
+      <w:r>
+        <w:rPr>
+          <w:b/>
+          <w:bCs/>
+        </w:rPr>
+        <w:t>:</w:t>
+      </w:r>
+      <w:r>
+        <w:rPr>
+          <w:b/>
+          <w:bCs/>
+        </w:rPr>
+        <w:br/>
+      </w:r>
+    </w:p>
+    <w:p>
+      <w:pPr>
+        <w:rPr>
+          <w:b/>
+          <w:bCs/>
+        </w:rPr>
+      </w:pPr>
+      <w:r>
+        <w:rPr>
+          <w:b/>
+          <w:bCs/>
+        </w:rPr>
+        <w:drawing>
+          <wp:inline distT="0" distB="0" distL="0" distR="0" wp14:anchorId="0E2C8311" wp14:editId="7B81CE39">
+            <wp:extent cx="5943600" cy="2070100"/>
+            <wp:effectExtent l="0" t="0" r="0" b="6350"/>
+            <wp:docPr id="1297908265" name="Picture 1"/>
+            <wp:cNvGraphicFramePr>
+              <a:graphicFrameLocks xmlns:a="http://schemas.openxmlformats.org/drawingml/2006/main" noChangeAspect="1"/>
+            </wp:cNvGraphicFramePr>
+            <a:graphic xmlns:a="http://schemas.openxmlformats.org/drawingml/2006/main">
+              <a:graphicData uri="http://schemas.openxmlformats.org/drawingml/2006/picture">
+                <pic:pic xmlns:pic="http://schemas.openxmlformats.org/drawingml/2006/picture">
+                  <pic:nvPicPr>
+                    <pic:cNvPr id="1297908265" name=""/>
+                    <pic:cNvPicPr/>
+                  </pic:nvPicPr>
+                  <pic:blipFill>
+                    <a:blip r:embed="rId8"/>
+                    <a:stretch>
+                      <a:fillRect/>
+                    </a:stretch>
+                  </pic:blipFill>
+                  <pic:spPr>
+                    <a:xfrm>
+                      <a:off x="0" y="0"/>
+                      <a:ext cx="5943600" cy="2070100"/>
+                    </a:xfrm>
+                    <a:prstGeom prst="rect">
+                      <a:avLst/>
+                    </a:prstGeom>
+                  </pic:spPr>
+                </pic:pic>
+              </a:graphicData>
+            </a:graphic>
+          </wp:inline>
+        </w:drawing>
+      </w:r>
+    </w:p>
     <w:p/>
     <w:p>
-      <w:r>
-        <w:lastRenderedPageBreak/>
+      <w:pPr>
+        <w:rPr>
+          <w:b/>
+          <w:bCs/>
+        </w:rPr>
+      </w:pPr>
+      <w:r>
+        <w:rPr>
+          <w:b/>
+          <w:bCs/>
+        </w:rPr>
+        <w:t xml:space="preserve">Why </w:t>
+      </w:r>
+      <w:r>
+        <w:rPr>
+          <w:b/>
+          <w:bCs/>
+        </w:rPr>
+        <w:t>did I make</w:t>
+      </w:r>
+      <w:r>
+        <w:rPr>
+          <w:b/>
+          <w:bCs/>
+        </w:rPr>
+        <w:t xml:space="preserve"> each tooling choice</w:t>
+      </w:r>
+      <w:r>
+        <w:rPr>
+          <w:b/>
+          <w:bCs/>
+        </w:rPr>
+        <w:t>?</w:t>
+      </w:r>
+    </w:p>
+    <w:p>
+      <w:pPr>
+        <w:pStyle w:val="ListParagraph"/>
+        <w:numPr>
+          <w:ilvl w:val="0"/>
+          <w:numId w:val="16"/>
+        </w:numPr>
+      </w:pPr>
+      <w:proofErr w:type="spellStart"/>
+      <w:r>
+        <w:t>Gradio</w:t>
+      </w:r>
+      <w:proofErr w:type="spellEnd"/>
+      <w:r>
+        <w:t xml:space="preserve"> was chosen because it provides the fastest path to a functional local UI where a user can upload files, choose a workflow, and inspect outputs without spending time on frontend engineering.</w:t>
+      </w:r>
+    </w:p>
+    <w:p>
+      <w:pPr>
+        <w:pStyle w:val="ListParagraph"/>
+      </w:pPr>
+    </w:p>
+    <w:p>
+      <w:pPr>
+        <w:pStyle w:val="ListParagraph"/>
+        <w:numPr>
+          <w:ilvl w:val="0"/>
+          <w:numId w:val="16"/>
+        </w:numPr>
+      </w:pPr>
+      <w:proofErr w:type="spellStart"/>
+      <w:r>
+        <w:t>LangGraph</w:t>
+      </w:r>
+      <w:proofErr w:type="spellEnd"/>
+      <w:r>
+        <w:t xml:space="preserve"> was chosen because this project is fundamentally a workflow-driven application, not a single prompt-response chatbot. </w:t>
+      </w:r>
+      <w:proofErr w:type="spellStart"/>
+      <w:r>
+        <w:t>LangGraph</w:t>
+      </w:r>
+      <w:proofErr w:type="spellEnd"/>
+      <w:r>
+        <w:t xml:space="preserve"> makes it easy to define explicit stages like planning, retrieval, drafting, review, and revision.</w:t>
+      </w:r>
+    </w:p>
+    <w:p/>
+    <w:p>
+      <w:pPr>
+        <w:pStyle w:val="ListParagraph"/>
+        <w:numPr>
+          <w:ilvl w:val="0"/>
+          <w:numId w:val="16"/>
+        </w:numPr>
+      </w:pPr>
+      <w:r>
+        <w:t>OpenAI chat models were chosen because they were easy to configure for planning, drafting, and quality review while also giving reliable structured output behavior for the prototype.</w:t>
+      </w:r>
+    </w:p>
+    <w:p/>
+    <w:p>
+      <w:pPr>
+        <w:pStyle w:val="ListParagraph"/>
+        <w:numPr>
+          <w:ilvl w:val="0"/>
+          <w:numId w:val="16"/>
+        </w:numPr>
+      </w:pPr>
+      <w:r>
+        <w:t>OpenAI embeddings were chosen because they integrate cleanly with the rest of the stack and provide strong semantic search performance for the small document corpus used in this MVP.</w:t>
+      </w:r>
+    </w:p>
+    <w:p/>
+    <w:p>
+      <w:pPr>
+        <w:pStyle w:val="ListParagraph"/>
+        <w:numPr>
+          <w:ilvl w:val="0"/>
+          <w:numId w:val="16"/>
+        </w:numPr>
+      </w:pPr>
+      <w:proofErr w:type="spellStart"/>
+      <w:r>
+        <w:t>Qdrant</w:t>
+      </w:r>
+      <w:proofErr w:type="spellEnd"/>
+      <w:r>
+        <w:t xml:space="preserve"> was chosen as the vector store because it is simple to use locally, works well with </w:t>
+      </w:r>
+      <w:proofErr w:type="spellStart"/>
+      <w:r>
+        <w:t>LangChain</w:t>
+      </w:r>
+      <w:proofErr w:type="spellEnd"/>
+      <w:r>
+        <w:t>/</w:t>
+      </w:r>
+      <w:proofErr w:type="spellStart"/>
+      <w:r>
+        <w:t>LangGraph</w:t>
+      </w:r>
+      <w:proofErr w:type="spellEnd"/>
+      <w:r>
+        <w:t xml:space="preserve"> pipelines, and is a good fit for dense retrieval over workpaper-style source files.</w:t>
+      </w:r>
+    </w:p>
+    <w:p/>
+    <w:p>
+      <w:pPr>
+        <w:pStyle w:val="ListParagraph"/>
+        <w:numPr>
+          <w:ilvl w:val="0"/>
+          <w:numId w:val="16"/>
+        </w:numPr>
+      </w:pPr>
+      <w:proofErr w:type="spellStart"/>
+      <w:r>
+        <w:t>RecursiveCharacterTextSplitter</w:t>
+      </w:r>
+      <w:proofErr w:type="spellEnd"/>
+      <w:r>
+        <w:t xml:space="preserve"> was chosen because the source documents are semi-structured and vary across markdown notes, CSV-like data, and spreadsheet-derived text, so a flexible </w:t>
+      </w:r>
+      <w:proofErr w:type="spellStart"/>
+      <w:r>
+        <w:t>chunker</w:t>
+      </w:r>
+      <w:proofErr w:type="spellEnd"/>
+      <w:r>
+        <w:t xml:space="preserve"> works better than a document-specific parser-only approach.</w:t>
+      </w:r>
+    </w:p>
+    <w:p/>
+    <w:p>
+      <w:pPr>
+        <w:pStyle w:val="ListParagraph"/>
+        <w:numPr>
+          <w:ilvl w:val="0"/>
+          <w:numId w:val="16"/>
+        </w:numPr>
+      </w:pPr>
+      <w:r>
+        <w:t>Markdown reports were chosen as the output artifact format because they are lightweight, easy to save, inspect, version, and later convert into more polished formats such as PDF or DOCX.</w:t>
+      </w:r>
+    </w:p>
+    <w:p/>
+    <w:p/>
+    <w:p>
+      <w:pPr>
+        <w:rPr>
+          <w:b/>
+          <w:bCs/>
+        </w:rPr>
+      </w:pPr>
+      <w:r>
+        <w:rPr>
+          <w:b/>
+          <w:bCs/>
+        </w:rPr>
+        <w:t>Why this stack fits the use case</w:t>
+      </w:r>
+    </w:p>
+    <w:p/>
+    <w:p>
+      <w:r>
+        <w:t xml:space="preserve">I intentionally chose a stack that supports workflow control, local experimentation, explainability, and quick iteration. Since the goal of </w:t>
+      </w:r>
+      <w:proofErr w:type="spellStart"/>
+      <w:r>
+        <w:t>SwarmMate</w:t>
+      </w:r>
+      <w:proofErr w:type="spellEnd"/>
+      <w:r>
+        <w:t xml:space="preserve"> is to act as a workflow adapter for messy pre-CCH audit work, the priority was not building a complex production UI or enterprise deployment layer first. The priority was proving that a structured, source-grounded workflow could produce a useful audit artifact end-to-end.</w:t>
+      </w:r>
+    </w:p>
+    <w:p/>
+    <w:p/>
+    <w:p/>
+    <w:p/>
+    <w:p>
+      <w:pPr>
+        <w:rPr>
+          <w:b/>
+          <w:bCs/>
+        </w:rPr>
+      </w:pPr>
+      <w:r>
+        <w:rPr>
+          <w:b/>
+          <w:bCs/>
+        </w:rPr>
         <w:t>3. Data + Keys</w:t>
       </w:r>
     </w:p>
@@ -555,6 +874,13 @@
           <w:bCs/>
         </w:rPr>
       </w:pPr>
+      <w:r>
+        <w:rPr>
+          <w:b/>
+          <w:bCs/>
+        </w:rPr>
+        <w:t xml:space="preserve">a. </w:t>
+      </w:r>
       <w:r>
         <w:rPr>
           <w:b/>
@@ -618,6 +944,7 @@
     </w:p>
     <w:p>
       <w:r>
+        <w:lastRenderedPageBreak/>
         <w:t>These files simulate the kinds of pre-CCH documents an audit team would review before finalizing planning materials.</w:t>
       </w:r>
     </w:p>
@@ -798,6 +1125,238 @@
         <w:t>saves the final report.</w:t>
       </w:r>
     </w:p>
+    <w:p>
+      <w:pPr>
+        <w:pStyle w:val="ListParagraph"/>
+      </w:pPr>
+    </w:p>
+    <w:p>
+      <w:pPr>
+        <w:rPr>
+          <w:rFonts w:ascii="Times New Roman" w:eastAsia="Times New Roman" w:hAnsi="Times New Roman" w:cs="Times New Roman"/>
+          <w:kern w:val="0"/>
+          <w14:ligatures w14:val="none"/>
+        </w:rPr>
+      </w:pPr>
+      <w:r>
+        <w:rPr>
+          <w:b/>
+          <w:bCs/>
+        </w:rPr>
+        <w:t>Default Chunking Strategy</w:t>
+      </w:r>
+    </w:p>
+    <w:p>
+      <w:pPr>
+        <w:pStyle w:val="ListParagraph"/>
+        <w:numPr>
+          <w:ilvl w:val="0"/>
+          <w:numId w:val="17"/>
+        </w:numPr>
+        <w:spacing w:after="0" w:line="240" w:lineRule="auto"/>
+        <w:rPr>
+          <w:rFonts w:ascii="Times New Roman" w:eastAsia="Times New Roman" w:hAnsi="Times New Roman" w:cs="Times New Roman"/>
+          <w:kern w:val="0"/>
+          <w14:ligatures w14:val="none"/>
+        </w:rPr>
+      </w:pPr>
+      <w:r>
+        <w:rPr>
+          <w:rFonts w:ascii="Times New Roman" w:eastAsia="Times New Roman" w:hAnsi="Times New Roman" w:cs="Times New Roman"/>
+          <w:kern w:val="0"/>
+          <w14:ligatures w14:val="none"/>
+        </w:rPr>
+        <w:t xml:space="preserve">The default chunking strategy for this project uses </w:t>
+      </w:r>
+      <w:proofErr w:type="spellStart"/>
+      <w:r>
+        <w:rPr>
+          <w:rFonts w:ascii="Times New Roman" w:eastAsia="Times New Roman" w:hAnsi="Times New Roman" w:cs="Times New Roman"/>
+          <w:b/>
+          <w:bCs/>
+          <w:kern w:val="0"/>
+          <w14:ligatures w14:val="none"/>
+        </w:rPr>
+        <w:t>RecursiveCharacterTextSplitter</w:t>
+      </w:r>
+      <w:proofErr w:type="spellEnd"/>
+      <w:r>
+        <w:rPr>
+          <w:rFonts w:ascii="Times New Roman" w:eastAsia="Times New Roman" w:hAnsi="Times New Roman" w:cs="Times New Roman"/>
+          <w:kern w:val="0"/>
+          <w14:ligatures w14:val="none"/>
+        </w:rPr>
+        <w:t xml:space="preserve"> with a chunk size of 900 characters and an overlap of 150 characters. This choice was made because the source documents in the MVP are heterogeneous: some are narrative markdown notes, some are checklist-style files such as PBC requests, and some are table-like or spreadsheet-derived files such as trial balance data. A recursive character-based splitter provides a practical middle ground for these different formats without requiring a separate chunking pipeline for each document type.</w:t>
+      </w:r>
+    </w:p>
+    <w:p>
+      <w:pPr>
+        <w:pStyle w:val="ListParagraph"/>
+        <w:spacing w:after="0" w:line="240" w:lineRule="auto"/>
+        <w:rPr>
+          <w:rFonts w:ascii="Times New Roman" w:eastAsia="Times New Roman" w:hAnsi="Times New Roman" w:cs="Times New Roman"/>
+          <w:kern w:val="0"/>
+          <w14:ligatures w14:val="none"/>
+        </w:rPr>
+      </w:pPr>
+    </w:p>
+    <w:p>
+      <w:pPr>
+        <w:pStyle w:val="ListParagraph"/>
+        <w:numPr>
+          <w:ilvl w:val="0"/>
+          <w:numId w:val="17"/>
+        </w:numPr>
+        <w:spacing w:after="0" w:line="240" w:lineRule="auto"/>
+        <w:rPr>
+          <w:rFonts w:ascii="Times New Roman" w:eastAsia="Times New Roman" w:hAnsi="Times New Roman" w:cs="Times New Roman"/>
+          <w:kern w:val="0"/>
+          <w14:ligatures w14:val="none"/>
+        </w:rPr>
+      </w:pPr>
+      <w:r>
+        <w:rPr>
+          <w:rFonts w:ascii="Times New Roman" w:eastAsia="Times New Roman" w:hAnsi="Times New Roman" w:cs="Times New Roman"/>
+          <w:kern w:val="0"/>
+          <w14:ligatures w14:val="none"/>
+        </w:rPr>
+        <w:t xml:space="preserve">I chose a chunk size of 900 because it is large enough to preserve local meaning within audit-related notes, control descriptions, and request lists, while still being small enough to support focused retrieval. A smaller chunk size might separate related evidence too aggressively and make it harder for the retriever to </w:t>
+      </w:r>
+      <w:proofErr w:type="gramStart"/>
+      <w:r>
+        <w:rPr>
+          <w:rFonts w:ascii="Times New Roman" w:eastAsia="Times New Roman" w:hAnsi="Times New Roman" w:cs="Times New Roman"/>
+          <w:kern w:val="0"/>
+          <w14:ligatures w14:val="none"/>
+        </w:rPr>
+        <w:t>return</w:t>
+      </w:r>
+      <w:proofErr w:type="gramEnd"/>
+      <w:r>
+        <w:rPr>
+          <w:rFonts w:ascii="Times New Roman" w:eastAsia="Times New Roman" w:hAnsi="Times New Roman" w:cs="Times New Roman"/>
+          <w:kern w:val="0"/>
+          <w14:ligatures w14:val="none"/>
+        </w:rPr>
+        <w:t xml:space="preserve"> coherent context. A larger chunk size would increase the risk of retrieving broad, noisy passages that dilute relevance. The 150-character overlap helps preserve continuity across chunk boundaries, which is important when important facts appear near the edge of a section.</w:t>
+      </w:r>
+    </w:p>
+    <w:p>
+      <w:pPr>
+        <w:pStyle w:val="ListParagraph"/>
+        <w:spacing w:after="0" w:line="240" w:lineRule="auto"/>
+        <w:rPr>
+          <w:rFonts w:ascii="Times New Roman" w:eastAsia="Times New Roman" w:hAnsi="Times New Roman" w:cs="Times New Roman"/>
+          <w:kern w:val="0"/>
+          <w14:ligatures w14:val="none"/>
+        </w:rPr>
+      </w:pPr>
+    </w:p>
+    <w:p>
+      <w:pPr>
+        <w:pStyle w:val="ListParagraph"/>
+        <w:numPr>
+          <w:ilvl w:val="0"/>
+          <w:numId w:val="17"/>
+        </w:numPr>
+        <w:spacing w:after="0" w:line="240" w:lineRule="auto"/>
+        <w:rPr>
+          <w:rFonts w:ascii="Times New Roman" w:eastAsia="Times New Roman" w:hAnsi="Times New Roman" w:cs="Times New Roman"/>
+          <w:kern w:val="0"/>
+          <w14:ligatures w14:val="none"/>
+        </w:rPr>
+      </w:pPr>
+      <w:r>
+        <w:rPr>
+          <w:rFonts w:ascii="Times New Roman" w:eastAsia="Times New Roman" w:hAnsi="Times New Roman" w:cs="Times New Roman"/>
+          <w:kern w:val="0"/>
+          <w14:ligatures w14:val="none"/>
+        </w:rPr>
+        <w:t xml:space="preserve">This strategy is especially appropriate for a workflow adapter like </w:t>
+      </w:r>
+      <w:proofErr w:type="spellStart"/>
+      <w:r>
+        <w:rPr>
+          <w:rFonts w:ascii="Times New Roman" w:eastAsia="Times New Roman" w:hAnsi="Times New Roman" w:cs="Times New Roman"/>
+          <w:kern w:val="0"/>
+          <w14:ligatures w14:val="none"/>
+        </w:rPr>
+        <w:t>SwarmMate</w:t>
+      </w:r>
+      <w:proofErr w:type="spellEnd"/>
+      <w:r>
+        <w:rPr>
+          <w:rFonts w:ascii="Times New Roman" w:eastAsia="Times New Roman" w:hAnsi="Times New Roman" w:cs="Times New Roman"/>
+          <w:kern w:val="0"/>
+          <w14:ligatures w14:val="none"/>
+        </w:rPr>
+        <w:t xml:space="preserve"> because many audit tasks depend on combining adjacent facts rather than retrieving a single isolated sentence. For example, a useful audit planning memo may need both the control issue itself and a nearby detail about timing, approval, or prior-year context. The overlap reduces the chance that those connected details are split into </w:t>
+      </w:r>
+      <w:proofErr w:type="gramStart"/>
+      <w:r>
+        <w:rPr>
+          <w:rFonts w:ascii="Times New Roman" w:eastAsia="Times New Roman" w:hAnsi="Times New Roman" w:cs="Times New Roman"/>
+          <w:kern w:val="0"/>
+          <w14:ligatures w14:val="none"/>
+        </w:rPr>
+        <w:t>completely separate</w:t>
+      </w:r>
+      <w:proofErr w:type="gramEnd"/>
+      <w:r>
+        <w:rPr>
+          <w:rFonts w:ascii="Times New Roman" w:eastAsia="Times New Roman" w:hAnsi="Times New Roman" w:cs="Times New Roman"/>
+          <w:kern w:val="0"/>
+          <w14:ligatures w14:val="none"/>
+        </w:rPr>
+        <w:t xml:space="preserve"> chunks.</w:t>
+      </w:r>
+    </w:p>
+    <w:p>
+      <w:pPr>
+        <w:pStyle w:val="ListParagraph"/>
+        <w:spacing w:after="0" w:line="240" w:lineRule="auto"/>
+        <w:rPr>
+          <w:rFonts w:ascii="Times New Roman" w:eastAsia="Times New Roman" w:hAnsi="Times New Roman" w:cs="Times New Roman"/>
+          <w:kern w:val="0"/>
+          <w14:ligatures w14:val="none"/>
+        </w:rPr>
+      </w:pPr>
+    </w:p>
+    <w:p>
+      <w:pPr>
+        <w:spacing w:after="0" w:line="240" w:lineRule="auto"/>
+        <w:ind w:left="720"/>
+        <w:rPr>
+          <w:rFonts w:ascii="Times New Roman" w:eastAsia="Times New Roman" w:hAnsi="Times New Roman" w:cs="Times New Roman"/>
+          <w:kern w:val="0"/>
+          <w14:ligatures w14:val="none"/>
+        </w:rPr>
+      </w:pPr>
+      <w:r>
+        <w:rPr>
+          <w:rFonts w:ascii="Times New Roman" w:eastAsia="Times New Roman" w:hAnsi="Times New Roman" w:cs="Times New Roman"/>
+          <w:kern w:val="0"/>
+          <w14:ligatures w14:val="none"/>
+        </w:rPr>
+        <w:t>Overall, the baseline chunking strategy was selected as a pragmatic default for an MVP: it is simple, general-purpose, and performs well enough to support strong retrieval precision while still leaving room for targeted retriever improvement.</w:t>
+      </w:r>
+    </w:p>
+    <w:p/>
+    <w:p/>
+    <w:p/>
+    <w:p/>
+    <w:p/>
+    <w:p/>
+    <w:p/>
+    <w:p/>
+    <w:p/>
+    <w:p/>
+    <w:p/>
+    <w:p/>
+    <w:p/>
+    <w:p/>
+    <w:p/>
+    <w:p/>
     <w:p/>
     <w:p/>
     <w:p/>
@@ -879,7 +1438,7 @@
                     <pic:cNvPicPr/>
                   </pic:nvPicPr>
                   <pic:blipFill>
-                    <a:blip r:embed="rId8"/>
+                    <a:blip r:embed="rId9"/>
                     <a:stretch>
                       <a:fillRect/>
                     </a:stretch>
@@ -1183,55 +1742,55 @@
           <w:kern w:val="0"/>
           <w14:ligatures w14:val="none"/>
         </w:rPr>
-        <w:t xml:space="preserve">To evaluate the baseline version of my </w:t>
-      </w:r>
-      <w:proofErr w:type="spellStart"/>
-      <w:r>
+        <w:t>To assess the baseline quality of the pipeline, I created a synthetic evaluation set of 5 audit-style prompts using the same sample workpaper corpus that drives the prototype. These prompts were designed to represent realistic audit tasks rather than generic factual questions. The test set included prompts about outstanding client requests, client background for planning, control and audit risk areas, trial-balance-based follow-up questions, and drafting a short audit planning memo.</w:t>
+      </w:r>
+    </w:p>
+    <w:p>
+      <w:pPr>
+        <w:spacing w:after="0" w:line="240" w:lineRule="auto"/>
+        <w:ind w:left="360"/>
         <w:rPr>
           <w:rFonts w:ascii="Times New Roman" w:eastAsia="Times New Roman" w:hAnsi="Times New Roman" w:cs="Times New Roman"/>
           <w:kern w:val="0"/>
           <w14:ligatures w14:val="none"/>
         </w:rPr>
-        <w:t>SwarmMate</w:t>
-      </w:r>
-      <w:proofErr w:type="spellEnd"/>
-      <w:r>
+      </w:pPr>
+    </w:p>
+    <w:p>
+      <w:pPr>
+        <w:spacing w:after="0" w:line="240" w:lineRule="auto"/>
+        <w:ind w:left="360"/>
         <w:rPr>
           <w:rFonts w:ascii="Times New Roman" w:eastAsia="Times New Roman" w:hAnsi="Times New Roman" w:cs="Times New Roman"/>
           <w:kern w:val="0"/>
           <w14:ligatures w14:val="none"/>
         </w:rPr>
-        <w:t xml:space="preserve"> Audit Workpaper Adapter, I created a small synthetic test set of 5 audit-style prompts based on the sample workpaper documents used in the prototype. These prompts covered common tasks such as identifying outstanding client requests, summarizing client background, surfacing control and audit risk areas, explaining a likely follow-up area in the trial balance, and drafting a short audit planning memo.</w:t>
-      </w:r>
-    </w:p>
-    <w:p>
-      <w:pPr>
-        <w:spacing w:after="0" w:line="240" w:lineRule="auto"/>
-        <w:ind w:left="360"/>
+      </w:pPr>
+      <w:r>
         <w:rPr>
           <w:rFonts w:ascii="Times New Roman" w:eastAsia="Times New Roman" w:hAnsi="Times New Roman" w:cs="Times New Roman"/>
           <w:kern w:val="0"/>
           <w14:ligatures w14:val="none"/>
         </w:rPr>
-      </w:pPr>
-    </w:p>
-    <w:p>
-      <w:pPr>
-        <w:spacing w:after="0" w:line="240" w:lineRule="auto"/>
-        <w:ind w:left="360"/>
+        <w:t xml:space="preserve">I evaluated the baseline system using the Ragas framework. The most stable metrics in this notebook run were LLM Context Precision with Reference and Context Recall. I also attempted Answer Relevancy, but that metric returned </w:t>
+      </w:r>
+      <w:proofErr w:type="spellStart"/>
+      <w:r>
         <w:rPr>
           <w:rFonts w:ascii="Times New Roman" w:eastAsia="Times New Roman" w:hAnsi="Times New Roman" w:cs="Times New Roman"/>
           <w:kern w:val="0"/>
           <w14:ligatures w14:val="none"/>
         </w:rPr>
-      </w:pPr>
+        <w:t>NaN</w:t>
+      </w:r>
+      <w:proofErr w:type="spellEnd"/>
       <w:r>
         <w:rPr>
           <w:rFonts w:ascii="Times New Roman" w:eastAsia="Times New Roman" w:hAnsi="Times New Roman" w:cs="Times New Roman"/>
           <w:kern w:val="0"/>
           <w14:ligatures w14:val="none"/>
         </w:rPr>
-        <w:t xml:space="preserve">I ran the baseline system through the Ragas evaluation framework using retrieval-focused metrics. The baseline achieved a perfect LLM Context Precision with Reference score of 1.0 across all 5 cases, which suggests that the retrieved chunks were consistently relevant to the user’s query. The system also achieved an average Context Recall score of 0.93, with four of the five cases scoring 1.0 and one case scoring 0.67. This indicates that the retriever </w:t>
+        <w:t xml:space="preserve"> due to evaluator incompatibility in the notebook environment. Rather than presenting that as a valid score, I treat it as a measurement limitation of the evaluation setup rather than a valid result for the model itself. </w:t>
       </w:r>
       <w:r>
         <w:rPr>
@@ -1240,7 +1799,7 @@
           <w14:ligatures w14:val="none"/>
         </w:rPr>
         <w:lastRenderedPageBreak/>
-        <w:t>generally captured the necessary supporting evidence, but there is still room to improve coverage for more complex risk-summary style questions.</w:t>
+        <w:t>To supplement the missing automatic relevance metric, I manually reviewed the generated artifacts for structure, grounding, and business usefulness.</w:t>
       </w:r>
     </w:p>
     <w:p>
@@ -1260,52 +1819,1334 @@
         <w:ind w:left="360"/>
         <w:rPr>
           <w:rFonts w:ascii="Times New Roman" w:eastAsia="Times New Roman" w:hAnsi="Times New Roman" w:cs="Times New Roman"/>
+          <w:b/>
+          <w:bCs/>
           <w:kern w:val="0"/>
+          <w:u w:val="single"/>
           <w14:ligatures w14:val="none"/>
         </w:rPr>
       </w:pPr>
       <w:r>
+        <w:rPr>
+          <w:rFonts w:ascii="Times New Roman" w:eastAsia="Times New Roman" w:hAnsi="Times New Roman" w:cs="Times New Roman"/>
+          <w:b/>
+          <w:bCs/>
+          <w:kern w:val="0"/>
+          <w:u w:val="single"/>
+          <w14:ligatures w14:val="none"/>
+        </w:rPr>
+        <w:t>Baseline results table</w:t>
+      </w:r>
+    </w:p>
+    <w:p>
+      <w:pPr>
+        <w:spacing w:after="0" w:line="240" w:lineRule="auto"/>
+        <w:ind w:left="360"/>
+        <w:rPr>
+          <w:rFonts w:ascii="Times New Roman" w:eastAsia="Times New Roman" w:hAnsi="Times New Roman" w:cs="Times New Roman"/>
+          <w:b/>
+          <w:bCs/>
+          <w:kern w:val="0"/>
+          <w:u w:val="single"/>
+          <w14:ligatures w14:val="none"/>
+        </w:rPr>
+      </w:pPr>
+    </w:p>
+    <w:tbl>
+      <w:tblPr>
+        <w:tblW w:w="5839" w:type="dxa"/>
+        <w:tblInd w:w="602" w:type="dxa"/>
+        <w:tblLook w:val="04A0" w:firstRow="1" w:lastRow="0" w:firstColumn="1" w:lastColumn="0" w:noHBand="0" w:noVBand="1"/>
+      </w:tblPr>
+      <w:tblGrid>
+        <w:gridCol w:w="1876"/>
+        <w:gridCol w:w="1140"/>
+        <w:gridCol w:w="948"/>
+        <w:gridCol w:w="849"/>
+        <w:gridCol w:w="1026"/>
+      </w:tblGrid>
+      <w:tr>
+        <w:trPr>
+          <w:trHeight w:val="490"/>
+        </w:trPr>
+        <w:tc>
+          <w:tcPr>
+            <w:tcW w:w="1876" w:type="dxa"/>
+            <w:tcBorders>
+              <w:top w:val="single" w:sz="8" w:space="0" w:color="FCFCFC"/>
+              <w:left w:val="single" w:sz="8" w:space="0" w:color="FCFCFC"/>
+              <w:bottom w:val="single" w:sz="8" w:space="0" w:color="FCFCFC"/>
+              <w:right w:val="single" w:sz="8" w:space="0" w:color="FCFCFC"/>
+            </w:tcBorders>
+            <w:shd w:val="clear" w:color="000000" w:fill="DADADA"/>
+            <w:vAlign w:val="center"/>
+            <w:hideMark/>
+          </w:tcPr>
+          <w:p>
+            <w:pPr>
+              <w:spacing w:after="0" w:line="240" w:lineRule="auto"/>
+              <w:rPr>
+                <w:rFonts w:ascii="Open Sans" w:eastAsia="Times New Roman" w:hAnsi="Open Sans" w:cs="Open Sans"/>
+                <w:b/>
+                <w:bCs/>
+                <w:color w:val="212529"/>
+                <w:kern w:val="0"/>
+                <w:sz w:val="16"/>
+                <w:szCs w:val="16"/>
+                <w14:ligatures w14:val="none"/>
+              </w:rPr>
+            </w:pPr>
+            <w:r>
+              <w:rPr>
+                <w:rFonts w:ascii="Open Sans" w:eastAsia="Times New Roman" w:hAnsi="Open Sans" w:cs="Open Sans"/>
+                <w:b/>
+                <w:bCs/>
+                <w:color w:val="212529"/>
+                <w:kern w:val="0"/>
+                <w:sz w:val="16"/>
+                <w:szCs w:val="16"/>
+                <w14:ligatures w14:val="none"/>
+              </w:rPr>
+              <w:t>Case ID</w:t>
+            </w:r>
+          </w:p>
+        </w:tc>
+        <w:tc>
+          <w:tcPr>
+            <w:tcW w:w="1140" w:type="dxa"/>
+            <w:tcBorders>
+              <w:top w:val="single" w:sz="8" w:space="0" w:color="FCFCFC"/>
+              <w:left w:val="nil"/>
+              <w:bottom w:val="single" w:sz="8" w:space="0" w:color="FCFCFC"/>
+              <w:right w:val="single" w:sz="8" w:space="0" w:color="FCFCFC"/>
+            </w:tcBorders>
+            <w:shd w:val="clear" w:color="000000" w:fill="DADADA"/>
+            <w:vAlign w:val="center"/>
+            <w:hideMark/>
+          </w:tcPr>
+          <w:p>
+            <w:pPr>
+              <w:spacing w:after="0" w:line="240" w:lineRule="auto"/>
+              <w:rPr>
+                <w:rFonts w:ascii="Open Sans" w:eastAsia="Times New Roman" w:hAnsi="Open Sans" w:cs="Open Sans"/>
+                <w:b/>
+                <w:bCs/>
+                <w:color w:val="212529"/>
+                <w:kern w:val="0"/>
+                <w:sz w:val="16"/>
+                <w:szCs w:val="16"/>
+                <w14:ligatures w14:val="none"/>
+              </w:rPr>
+            </w:pPr>
+            <w:r>
+              <w:rPr>
+                <w:rFonts w:ascii="Open Sans" w:eastAsia="Times New Roman" w:hAnsi="Open Sans" w:cs="Open Sans"/>
+                <w:b/>
+                <w:bCs/>
+                <w:color w:val="212529"/>
+                <w:kern w:val="0"/>
+                <w:sz w:val="16"/>
+                <w:szCs w:val="16"/>
+                <w14:ligatures w14:val="none"/>
+              </w:rPr>
+              <w:t>Prompt Type</w:t>
+            </w:r>
+          </w:p>
+        </w:tc>
+        <w:tc>
+          <w:tcPr>
+            <w:tcW w:w="948" w:type="dxa"/>
+            <w:tcBorders>
+              <w:top w:val="single" w:sz="8" w:space="0" w:color="FCFCFC"/>
+              <w:left w:val="nil"/>
+              <w:bottom w:val="single" w:sz="8" w:space="0" w:color="FCFCFC"/>
+              <w:right w:val="single" w:sz="8" w:space="0" w:color="FCFCFC"/>
+            </w:tcBorders>
+            <w:shd w:val="clear" w:color="000000" w:fill="DADADA"/>
+            <w:vAlign w:val="center"/>
+            <w:hideMark/>
+          </w:tcPr>
+          <w:p>
+            <w:pPr>
+              <w:spacing w:after="0" w:line="240" w:lineRule="auto"/>
+              <w:rPr>
+                <w:rFonts w:ascii="Open Sans" w:eastAsia="Times New Roman" w:hAnsi="Open Sans" w:cs="Open Sans"/>
+                <w:b/>
+                <w:bCs/>
+                <w:color w:val="212529"/>
+                <w:kern w:val="0"/>
+                <w:sz w:val="16"/>
+                <w:szCs w:val="16"/>
+                <w14:ligatures w14:val="none"/>
+              </w:rPr>
+            </w:pPr>
+            <w:r>
+              <w:rPr>
+                <w:rFonts w:ascii="Open Sans" w:eastAsia="Times New Roman" w:hAnsi="Open Sans" w:cs="Open Sans"/>
+                <w:b/>
+                <w:bCs/>
+                <w:color w:val="212529"/>
+                <w:kern w:val="0"/>
+                <w:sz w:val="16"/>
+                <w:szCs w:val="16"/>
+                <w14:ligatures w14:val="none"/>
+              </w:rPr>
+              <w:t>Context Precision</w:t>
+            </w:r>
+          </w:p>
+        </w:tc>
+        <w:tc>
+          <w:tcPr>
+            <w:tcW w:w="849" w:type="dxa"/>
+            <w:tcBorders>
+              <w:top w:val="single" w:sz="8" w:space="0" w:color="FCFCFC"/>
+              <w:left w:val="nil"/>
+              <w:bottom w:val="single" w:sz="8" w:space="0" w:color="FCFCFC"/>
+              <w:right w:val="single" w:sz="8" w:space="0" w:color="FCFCFC"/>
+            </w:tcBorders>
+            <w:shd w:val="clear" w:color="000000" w:fill="DADADA"/>
+            <w:vAlign w:val="center"/>
+            <w:hideMark/>
+          </w:tcPr>
+          <w:p>
+            <w:pPr>
+              <w:spacing w:after="0" w:line="240" w:lineRule="auto"/>
+              <w:rPr>
+                <w:rFonts w:ascii="Open Sans" w:eastAsia="Times New Roman" w:hAnsi="Open Sans" w:cs="Open Sans"/>
+                <w:b/>
+                <w:bCs/>
+                <w:color w:val="212529"/>
+                <w:kern w:val="0"/>
+                <w:sz w:val="16"/>
+                <w:szCs w:val="16"/>
+                <w14:ligatures w14:val="none"/>
+              </w:rPr>
+            </w:pPr>
+            <w:r>
+              <w:rPr>
+                <w:rFonts w:ascii="Open Sans" w:eastAsia="Times New Roman" w:hAnsi="Open Sans" w:cs="Open Sans"/>
+                <w:b/>
+                <w:bCs/>
+                <w:color w:val="212529"/>
+                <w:kern w:val="0"/>
+                <w:sz w:val="16"/>
+                <w:szCs w:val="16"/>
+                <w14:ligatures w14:val="none"/>
+              </w:rPr>
+              <w:t>Context Recall</w:t>
+            </w:r>
+          </w:p>
+        </w:tc>
+        <w:tc>
+          <w:tcPr>
+            <w:tcW w:w="1026" w:type="dxa"/>
+            <w:tcBorders>
+              <w:top w:val="single" w:sz="8" w:space="0" w:color="FCFCFC"/>
+              <w:left w:val="nil"/>
+              <w:bottom w:val="single" w:sz="8" w:space="0" w:color="FCFCFC"/>
+              <w:right w:val="single" w:sz="8" w:space="0" w:color="FCFCFC"/>
+            </w:tcBorders>
+            <w:shd w:val="clear" w:color="000000" w:fill="DADADA"/>
+            <w:vAlign w:val="center"/>
+            <w:hideMark/>
+          </w:tcPr>
+          <w:p>
+            <w:pPr>
+              <w:spacing w:after="0" w:line="240" w:lineRule="auto"/>
+              <w:rPr>
+                <w:rFonts w:ascii="Open Sans" w:eastAsia="Times New Roman" w:hAnsi="Open Sans" w:cs="Open Sans"/>
+                <w:b/>
+                <w:bCs/>
+                <w:color w:val="212529"/>
+                <w:kern w:val="0"/>
+                <w:sz w:val="16"/>
+                <w:szCs w:val="16"/>
+                <w14:ligatures w14:val="none"/>
+              </w:rPr>
+            </w:pPr>
+            <w:r>
+              <w:rPr>
+                <w:rFonts w:ascii="Open Sans" w:eastAsia="Times New Roman" w:hAnsi="Open Sans" w:cs="Open Sans"/>
+                <w:b/>
+                <w:bCs/>
+                <w:color w:val="212529"/>
+                <w:kern w:val="0"/>
+                <w:sz w:val="16"/>
+                <w:szCs w:val="16"/>
+                <w14:ligatures w14:val="none"/>
+              </w:rPr>
+              <w:t>Answer Relevancy</w:t>
+            </w:r>
+          </w:p>
+        </w:tc>
+      </w:tr>
+      <w:tr>
+        <w:trPr>
+          <w:trHeight w:val="730"/>
+        </w:trPr>
+        <w:tc>
+          <w:tcPr>
+            <w:tcW w:w="1876" w:type="dxa"/>
+            <w:tcBorders>
+              <w:top w:val="single" w:sz="8" w:space="0" w:color="DADADA"/>
+              <w:left w:val="single" w:sz="8" w:space="0" w:color="DADADA"/>
+              <w:bottom w:val="single" w:sz="8" w:space="0" w:color="DADADA"/>
+              <w:right w:val="single" w:sz="8" w:space="0" w:color="DADADA"/>
+            </w:tcBorders>
+            <w:shd w:val="clear" w:color="000000" w:fill="FFFFFF"/>
+            <w:vAlign w:val="center"/>
+            <w:hideMark/>
+          </w:tcPr>
+          <w:p>
+            <w:pPr>
+              <w:spacing w:after="0" w:line="240" w:lineRule="auto"/>
+              <w:rPr>
+                <w:rFonts w:ascii="Open Sans" w:eastAsia="Times New Roman" w:hAnsi="Open Sans" w:cs="Open Sans"/>
+                <w:color w:val="212529"/>
+                <w:kern w:val="0"/>
+                <w:sz w:val="16"/>
+                <w:szCs w:val="16"/>
+                <w14:ligatures w14:val="none"/>
+              </w:rPr>
+            </w:pPr>
+            <w:proofErr w:type="spellStart"/>
+            <w:r>
+              <w:rPr>
+                <w:rFonts w:ascii="Open Sans" w:eastAsia="Times New Roman" w:hAnsi="Open Sans" w:cs="Open Sans"/>
+                <w:color w:val="212529"/>
+                <w:kern w:val="0"/>
+                <w:sz w:val="16"/>
+                <w:szCs w:val="16"/>
+                <w14:ligatures w14:val="none"/>
+              </w:rPr>
+              <w:t>open_items</w:t>
+            </w:r>
+            <w:proofErr w:type="spellEnd"/>
+          </w:p>
+        </w:tc>
+        <w:tc>
+          <w:tcPr>
+            <w:tcW w:w="1140" w:type="dxa"/>
+            <w:tcBorders>
+              <w:top w:val="single" w:sz="8" w:space="0" w:color="DADADA"/>
+              <w:left w:val="nil"/>
+              <w:bottom w:val="single" w:sz="8" w:space="0" w:color="DADADA"/>
+              <w:right w:val="single" w:sz="8" w:space="0" w:color="DADADA"/>
+            </w:tcBorders>
+            <w:shd w:val="clear" w:color="000000" w:fill="FFFFFF"/>
+            <w:vAlign w:val="center"/>
+            <w:hideMark/>
+          </w:tcPr>
+          <w:p>
+            <w:pPr>
+              <w:spacing w:after="0" w:line="240" w:lineRule="auto"/>
+              <w:rPr>
+                <w:rFonts w:ascii="Open Sans" w:eastAsia="Times New Roman" w:hAnsi="Open Sans" w:cs="Open Sans"/>
+                <w:color w:val="212529"/>
+                <w:kern w:val="0"/>
+                <w:sz w:val="16"/>
+                <w:szCs w:val="16"/>
+                <w14:ligatures w14:val="none"/>
+              </w:rPr>
+            </w:pPr>
+            <w:r>
+              <w:rPr>
+                <w:rFonts w:ascii="Open Sans" w:eastAsia="Times New Roman" w:hAnsi="Open Sans" w:cs="Open Sans"/>
+                <w:color w:val="212529"/>
+                <w:kern w:val="0"/>
+                <w:sz w:val="16"/>
+                <w:szCs w:val="16"/>
+                <w14:ligatures w14:val="none"/>
+              </w:rPr>
+              <w:t>Outstanding items from client</w:t>
+            </w:r>
+          </w:p>
+        </w:tc>
+        <w:tc>
+          <w:tcPr>
+            <w:tcW w:w="948" w:type="dxa"/>
+            <w:tcBorders>
+              <w:top w:val="single" w:sz="8" w:space="0" w:color="DADADA"/>
+              <w:left w:val="nil"/>
+              <w:bottom w:val="single" w:sz="8" w:space="0" w:color="DADADA"/>
+              <w:right w:val="single" w:sz="8" w:space="0" w:color="DADADA"/>
+            </w:tcBorders>
+            <w:shd w:val="clear" w:color="000000" w:fill="FFFFFF"/>
+            <w:vAlign w:val="center"/>
+            <w:hideMark/>
+          </w:tcPr>
+          <w:p>
+            <w:pPr>
+              <w:spacing w:after="0" w:line="240" w:lineRule="auto"/>
+              <w:jc w:val="right"/>
+              <w:rPr>
+                <w:rFonts w:ascii="Open Sans" w:eastAsia="Times New Roman" w:hAnsi="Open Sans" w:cs="Open Sans"/>
+                <w:color w:val="212529"/>
+                <w:kern w:val="0"/>
+                <w:sz w:val="16"/>
+                <w:szCs w:val="16"/>
+                <w14:ligatures w14:val="none"/>
+              </w:rPr>
+            </w:pPr>
+            <w:r>
+              <w:rPr>
+                <w:rFonts w:ascii="Open Sans" w:eastAsia="Times New Roman" w:hAnsi="Open Sans" w:cs="Open Sans"/>
+                <w:color w:val="212529"/>
+                <w:kern w:val="0"/>
+                <w:sz w:val="16"/>
+                <w:szCs w:val="16"/>
+                <w14:ligatures w14:val="none"/>
+              </w:rPr>
+              <w:t>1</w:t>
+            </w:r>
+          </w:p>
+        </w:tc>
+        <w:tc>
+          <w:tcPr>
+            <w:tcW w:w="849" w:type="dxa"/>
+            <w:tcBorders>
+              <w:top w:val="single" w:sz="8" w:space="0" w:color="DADADA"/>
+              <w:left w:val="nil"/>
+              <w:bottom w:val="single" w:sz="8" w:space="0" w:color="DADADA"/>
+              <w:right w:val="single" w:sz="8" w:space="0" w:color="DADADA"/>
+            </w:tcBorders>
+            <w:shd w:val="clear" w:color="000000" w:fill="FFFFFF"/>
+            <w:vAlign w:val="center"/>
+            <w:hideMark/>
+          </w:tcPr>
+          <w:p>
+            <w:pPr>
+              <w:spacing w:after="0" w:line="240" w:lineRule="auto"/>
+              <w:jc w:val="right"/>
+              <w:rPr>
+                <w:rFonts w:ascii="Open Sans" w:eastAsia="Times New Roman" w:hAnsi="Open Sans" w:cs="Open Sans"/>
+                <w:color w:val="212529"/>
+                <w:kern w:val="0"/>
+                <w:sz w:val="16"/>
+                <w:szCs w:val="16"/>
+                <w14:ligatures w14:val="none"/>
+              </w:rPr>
+            </w:pPr>
+            <w:r>
+              <w:rPr>
+                <w:rFonts w:ascii="Open Sans" w:eastAsia="Times New Roman" w:hAnsi="Open Sans" w:cs="Open Sans"/>
+                <w:color w:val="212529"/>
+                <w:kern w:val="0"/>
+                <w:sz w:val="16"/>
+                <w:szCs w:val="16"/>
+                <w14:ligatures w14:val="none"/>
+              </w:rPr>
+              <w:t>1</w:t>
+            </w:r>
+          </w:p>
+        </w:tc>
+        <w:tc>
+          <w:tcPr>
+            <w:tcW w:w="1026" w:type="dxa"/>
+            <w:tcBorders>
+              <w:top w:val="single" w:sz="8" w:space="0" w:color="DADADA"/>
+              <w:left w:val="nil"/>
+              <w:bottom w:val="single" w:sz="8" w:space="0" w:color="DADADA"/>
+              <w:right w:val="single" w:sz="8" w:space="0" w:color="DADADA"/>
+            </w:tcBorders>
+            <w:shd w:val="clear" w:color="000000" w:fill="FFFFFF"/>
+            <w:vAlign w:val="center"/>
+            <w:hideMark/>
+          </w:tcPr>
+          <w:p>
+            <w:pPr>
+              <w:spacing w:after="0" w:line="240" w:lineRule="auto"/>
+              <w:rPr>
+                <w:rFonts w:ascii="Open Sans" w:eastAsia="Times New Roman" w:hAnsi="Open Sans" w:cs="Open Sans"/>
+                <w:color w:val="212529"/>
+                <w:kern w:val="0"/>
+                <w:sz w:val="16"/>
+                <w:szCs w:val="16"/>
+                <w14:ligatures w14:val="none"/>
+              </w:rPr>
+            </w:pPr>
+            <w:r>
+              <w:rPr>
+                <w:rFonts w:ascii="Open Sans" w:eastAsia="Times New Roman" w:hAnsi="Open Sans" w:cs="Open Sans"/>
+                <w:color w:val="212529"/>
+                <w:kern w:val="0"/>
+                <w:sz w:val="16"/>
+                <w:szCs w:val="16"/>
+                <w14:ligatures w14:val="none"/>
+              </w:rPr>
+              <w:t>N/A</w:t>
+            </w:r>
+          </w:p>
+        </w:tc>
+      </w:tr>
+      <w:tr>
+        <w:trPr>
+          <w:trHeight w:val="970"/>
+        </w:trPr>
+        <w:tc>
+          <w:tcPr>
+            <w:tcW w:w="1876" w:type="dxa"/>
+            <w:tcBorders>
+              <w:top w:val="nil"/>
+              <w:left w:val="single" w:sz="8" w:space="0" w:color="DADADA"/>
+              <w:bottom w:val="single" w:sz="8" w:space="0" w:color="DADADA"/>
+              <w:right w:val="single" w:sz="8" w:space="0" w:color="DADADA"/>
+            </w:tcBorders>
+            <w:shd w:val="clear" w:color="000000" w:fill="FFFFFF"/>
+            <w:vAlign w:val="center"/>
+            <w:hideMark/>
+          </w:tcPr>
+          <w:p>
+            <w:pPr>
+              <w:spacing w:after="0" w:line="240" w:lineRule="auto"/>
+              <w:rPr>
+                <w:rFonts w:ascii="Open Sans" w:eastAsia="Times New Roman" w:hAnsi="Open Sans" w:cs="Open Sans"/>
+                <w:color w:val="212529"/>
+                <w:kern w:val="0"/>
+                <w:sz w:val="16"/>
+                <w:szCs w:val="16"/>
+                <w14:ligatures w14:val="none"/>
+              </w:rPr>
+            </w:pPr>
+            <w:proofErr w:type="spellStart"/>
+            <w:r>
+              <w:rPr>
+                <w:rFonts w:ascii="Open Sans" w:eastAsia="Times New Roman" w:hAnsi="Open Sans" w:cs="Open Sans"/>
+                <w:color w:val="212529"/>
+                <w:kern w:val="0"/>
+                <w:sz w:val="16"/>
+                <w:szCs w:val="16"/>
+                <w14:ligatures w14:val="none"/>
+              </w:rPr>
+              <w:t>client_background</w:t>
+            </w:r>
+            <w:proofErr w:type="spellEnd"/>
+          </w:p>
+        </w:tc>
+        <w:tc>
+          <w:tcPr>
+            <w:tcW w:w="1140" w:type="dxa"/>
+            <w:tcBorders>
+              <w:top w:val="nil"/>
+              <w:left w:val="nil"/>
+              <w:bottom w:val="single" w:sz="8" w:space="0" w:color="DADADA"/>
+              <w:right w:val="single" w:sz="8" w:space="0" w:color="DADADA"/>
+            </w:tcBorders>
+            <w:shd w:val="clear" w:color="000000" w:fill="FFFFFF"/>
+            <w:vAlign w:val="center"/>
+            <w:hideMark/>
+          </w:tcPr>
+          <w:p>
+            <w:pPr>
+              <w:spacing w:after="0" w:line="240" w:lineRule="auto"/>
+              <w:rPr>
+                <w:rFonts w:ascii="Open Sans" w:eastAsia="Times New Roman" w:hAnsi="Open Sans" w:cs="Open Sans"/>
+                <w:color w:val="212529"/>
+                <w:kern w:val="0"/>
+                <w:sz w:val="16"/>
+                <w:szCs w:val="16"/>
+                <w14:ligatures w14:val="none"/>
+              </w:rPr>
+            </w:pPr>
+            <w:r>
+              <w:rPr>
+                <w:rFonts w:ascii="Open Sans" w:eastAsia="Times New Roman" w:hAnsi="Open Sans" w:cs="Open Sans"/>
+                <w:color w:val="212529"/>
+                <w:kern w:val="0"/>
+                <w:sz w:val="16"/>
+                <w:szCs w:val="16"/>
+                <w14:ligatures w14:val="none"/>
+              </w:rPr>
+              <w:t>Client summary for planning</w:t>
+            </w:r>
+          </w:p>
+        </w:tc>
+        <w:tc>
+          <w:tcPr>
+            <w:tcW w:w="948" w:type="dxa"/>
+            <w:tcBorders>
+              <w:top w:val="nil"/>
+              <w:left w:val="nil"/>
+              <w:bottom w:val="single" w:sz="8" w:space="0" w:color="DADADA"/>
+              <w:right w:val="single" w:sz="8" w:space="0" w:color="DADADA"/>
+            </w:tcBorders>
+            <w:shd w:val="clear" w:color="000000" w:fill="FFFFFF"/>
+            <w:vAlign w:val="center"/>
+            <w:hideMark/>
+          </w:tcPr>
+          <w:p>
+            <w:pPr>
+              <w:spacing w:after="0" w:line="240" w:lineRule="auto"/>
+              <w:jc w:val="right"/>
+              <w:rPr>
+                <w:rFonts w:ascii="Open Sans" w:eastAsia="Times New Roman" w:hAnsi="Open Sans" w:cs="Open Sans"/>
+                <w:color w:val="212529"/>
+                <w:kern w:val="0"/>
+                <w:sz w:val="16"/>
+                <w:szCs w:val="16"/>
+                <w14:ligatures w14:val="none"/>
+              </w:rPr>
+            </w:pPr>
+            <w:r>
+              <w:rPr>
+                <w:rFonts w:ascii="Open Sans" w:eastAsia="Times New Roman" w:hAnsi="Open Sans" w:cs="Open Sans"/>
+                <w:color w:val="212529"/>
+                <w:kern w:val="0"/>
+                <w:sz w:val="16"/>
+                <w:szCs w:val="16"/>
+                <w14:ligatures w14:val="none"/>
+              </w:rPr>
+              <w:t>1</w:t>
+            </w:r>
+          </w:p>
+        </w:tc>
+        <w:tc>
+          <w:tcPr>
+            <w:tcW w:w="849" w:type="dxa"/>
+            <w:tcBorders>
+              <w:top w:val="nil"/>
+              <w:left w:val="nil"/>
+              <w:bottom w:val="single" w:sz="8" w:space="0" w:color="DADADA"/>
+              <w:right w:val="single" w:sz="8" w:space="0" w:color="DADADA"/>
+            </w:tcBorders>
+            <w:shd w:val="clear" w:color="000000" w:fill="FFFFFF"/>
+            <w:vAlign w:val="center"/>
+            <w:hideMark/>
+          </w:tcPr>
+          <w:p>
+            <w:pPr>
+              <w:spacing w:after="0" w:line="240" w:lineRule="auto"/>
+              <w:jc w:val="right"/>
+              <w:rPr>
+                <w:rFonts w:ascii="Open Sans" w:eastAsia="Times New Roman" w:hAnsi="Open Sans" w:cs="Open Sans"/>
+                <w:color w:val="212529"/>
+                <w:kern w:val="0"/>
+                <w:sz w:val="16"/>
+                <w:szCs w:val="16"/>
+                <w14:ligatures w14:val="none"/>
+              </w:rPr>
+            </w:pPr>
+            <w:r>
+              <w:rPr>
+                <w:rFonts w:ascii="Open Sans" w:eastAsia="Times New Roman" w:hAnsi="Open Sans" w:cs="Open Sans"/>
+                <w:color w:val="212529"/>
+                <w:kern w:val="0"/>
+                <w:sz w:val="16"/>
+                <w:szCs w:val="16"/>
+                <w14:ligatures w14:val="none"/>
+              </w:rPr>
+              <w:t>1</w:t>
+            </w:r>
+          </w:p>
+        </w:tc>
+        <w:tc>
+          <w:tcPr>
+            <w:tcW w:w="1026" w:type="dxa"/>
+            <w:tcBorders>
+              <w:top w:val="nil"/>
+              <w:left w:val="nil"/>
+              <w:bottom w:val="single" w:sz="8" w:space="0" w:color="DADADA"/>
+              <w:right w:val="single" w:sz="8" w:space="0" w:color="DADADA"/>
+            </w:tcBorders>
+            <w:shd w:val="clear" w:color="000000" w:fill="FFFFFF"/>
+            <w:vAlign w:val="center"/>
+            <w:hideMark/>
+          </w:tcPr>
+          <w:p>
+            <w:pPr>
+              <w:spacing w:after="0" w:line="240" w:lineRule="auto"/>
+              <w:rPr>
+                <w:rFonts w:ascii="Open Sans" w:eastAsia="Times New Roman" w:hAnsi="Open Sans" w:cs="Open Sans"/>
+                <w:color w:val="212529"/>
+                <w:kern w:val="0"/>
+                <w:sz w:val="16"/>
+                <w:szCs w:val="16"/>
+                <w14:ligatures w14:val="none"/>
+              </w:rPr>
+            </w:pPr>
+            <w:r>
+              <w:rPr>
+                <w:rFonts w:ascii="Open Sans" w:eastAsia="Times New Roman" w:hAnsi="Open Sans" w:cs="Open Sans"/>
+                <w:color w:val="212529"/>
+                <w:kern w:val="0"/>
+                <w:sz w:val="16"/>
+                <w:szCs w:val="16"/>
+                <w14:ligatures w14:val="none"/>
+              </w:rPr>
+              <w:t>N/A</w:t>
+            </w:r>
+          </w:p>
+        </w:tc>
+      </w:tr>
+      <w:tr>
+        <w:trPr>
+          <w:trHeight w:val="730"/>
+        </w:trPr>
+        <w:tc>
+          <w:tcPr>
+            <w:tcW w:w="1876" w:type="dxa"/>
+            <w:tcBorders>
+              <w:top w:val="nil"/>
+              <w:left w:val="single" w:sz="8" w:space="0" w:color="DADADA"/>
+              <w:bottom w:val="single" w:sz="8" w:space="0" w:color="DADADA"/>
+              <w:right w:val="single" w:sz="8" w:space="0" w:color="DADADA"/>
+            </w:tcBorders>
+            <w:shd w:val="clear" w:color="000000" w:fill="FFFFFF"/>
+            <w:vAlign w:val="center"/>
+            <w:hideMark/>
+          </w:tcPr>
+          <w:p>
+            <w:pPr>
+              <w:spacing w:after="0" w:line="240" w:lineRule="auto"/>
+              <w:rPr>
+                <w:rFonts w:ascii="Open Sans" w:eastAsia="Times New Roman" w:hAnsi="Open Sans" w:cs="Open Sans"/>
+                <w:color w:val="212529"/>
+                <w:kern w:val="0"/>
+                <w:sz w:val="16"/>
+                <w:szCs w:val="16"/>
+                <w14:ligatures w14:val="none"/>
+              </w:rPr>
+            </w:pPr>
+            <w:proofErr w:type="spellStart"/>
+            <w:r>
+              <w:rPr>
+                <w:rFonts w:ascii="Open Sans" w:eastAsia="Times New Roman" w:hAnsi="Open Sans" w:cs="Open Sans"/>
+                <w:color w:val="212529"/>
+                <w:kern w:val="0"/>
+                <w:sz w:val="16"/>
+                <w:szCs w:val="16"/>
+                <w14:ligatures w14:val="none"/>
+              </w:rPr>
+              <w:t>control_risks</w:t>
+            </w:r>
+            <w:proofErr w:type="spellEnd"/>
+          </w:p>
+        </w:tc>
+        <w:tc>
+          <w:tcPr>
+            <w:tcW w:w="1140" w:type="dxa"/>
+            <w:tcBorders>
+              <w:top w:val="nil"/>
+              <w:left w:val="nil"/>
+              <w:bottom w:val="single" w:sz="8" w:space="0" w:color="DADADA"/>
+              <w:right w:val="single" w:sz="8" w:space="0" w:color="DADADA"/>
+            </w:tcBorders>
+            <w:shd w:val="clear" w:color="000000" w:fill="FFFFFF"/>
+            <w:vAlign w:val="center"/>
+            <w:hideMark/>
+          </w:tcPr>
+          <w:p>
+            <w:pPr>
+              <w:spacing w:after="0" w:line="240" w:lineRule="auto"/>
+              <w:rPr>
+                <w:rFonts w:ascii="Open Sans" w:eastAsia="Times New Roman" w:hAnsi="Open Sans" w:cs="Open Sans"/>
+                <w:color w:val="212529"/>
+                <w:kern w:val="0"/>
+                <w:sz w:val="16"/>
+                <w:szCs w:val="16"/>
+                <w14:ligatures w14:val="none"/>
+              </w:rPr>
+            </w:pPr>
+            <w:r>
+              <w:rPr>
+                <w:rFonts w:ascii="Open Sans" w:eastAsia="Times New Roman" w:hAnsi="Open Sans" w:cs="Open Sans"/>
+                <w:color w:val="212529"/>
+                <w:kern w:val="0"/>
+                <w:sz w:val="16"/>
+                <w:szCs w:val="16"/>
+                <w14:ligatures w14:val="none"/>
+              </w:rPr>
+              <w:t>Control and audit risk areas</w:t>
+            </w:r>
+          </w:p>
+        </w:tc>
+        <w:tc>
+          <w:tcPr>
+            <w:tcW w:w="948" w:type="dxa"/>
+            <w:tcBorders>
+              <w:top w:val="nil"/>
+              <w:left w:val="nil"/>
+              <w:bottom w:val="single" w:sz="8" w:space="0" w:color="DADADA"/>
+              <w:right w:val="single" w:sz="8" w:space="0" w:color="DADADA"/>
+            </w:tcBorders>
+            <w:shd w:val="clear" w:color="000000" w:fill="FFFFFF"/>
+            <w:vAlign w:val="center"/>
+            <w:hideMark/>
+          </w:tcPr>
+          <w:p>
+            <w:pPr>
+              <w:spacing w:after="0" w:line="240" w:lineRule="auto"/>
+              <w:jc w:val="right"/>
+              <w:rPr>
+                <w:rFonts w:ascii="Open Sans" w:eastAsia="Times New Roman" w:hAnsi="Open Sans" w:cs="Open Sans"/>
+                <w:color w:val="212529"/>
+                <w:kern w:val="0"/>
+                <w:sz w:val="16"/>
+                <w:szCs w:val="16"/>
+                <w14:ligatures w14:val="none"/>
+              </w:rPr>
+            </w:pPr>
+            <w:r>
+              <w:rPr>
+                <w:rFonts w:ascii="Open Sans" w:eastAsia="Times New Roman" w:hAnsi="Open Sans" w:cs="Open Sans"/>
+                <w:color w:val="212529"/>
+                <w:kern w:val="0"/>
+                <w:sz w:val="16"/>
+                <w:szCs w:val="16"/>
+                <w14:ligatures w14:val="none"/>
+              </w:rPr>
+              <w:t>1</w:t>
+            </w:r>
+          </w:p>
+        </w:tc>
+        <w:tc>
+          <w:tcPr>
+            <w:tcW w:w="849" w:type="dxa"/>
+            <w:tcBorders>
+              <w:top w:val="nil"/>
+              <w:left w:val="nil"/>
+              <w:bottom w:val="single" w:sz="8" w:space="0" w:color="DADADA"/>
+              <w:right w:val="single" w:sz="8" w:space="0" w:color="DADADA"/>
+            </w:tcBorders>
+            <w:shd w:val="clear" w:color="000000" w:fill="FFFFFF"/>
+            <w:vAlign w:val="center"/>
+            <w:hideMark/>
+          </w:tcPr>
+          <w:p>
+            <w:pPr>
+              <w:spacing w:after="0" w:line="240" w:lineRule="auto"/>
+              <w:jc w:val="right"/>
+              <w:rPr>
+                <w:rFonts w:ascii="Open Sans" w:eastAsia="Times New Roman" w:hAnsi="Open Sans" w:cs="Open Sans"/>
+                <w:color w:val="212529"/>
+                <w:kern w:val="0"/>
+                <w:sz w:val="16"/>
+                <w:szCs w:val="16"/>
+                <w14:ligatures w14:val="none"/>
+              </w:rPr>
+            </w:pPr>
+            <w:r>
+              <w:rPr>
+                <w:rFonts w:ascii="Open Sans" w:eastAsia="Times New Roman" w:hAnsi="Open Sans" w:cs="Open Sans"/>
+                <w:color w:val="212529"/>
+                <w:kern w:val="0"/>
+                <w:sz w:val="16"/>
+                <w:szCs w:val="16"/>
+                <w14:ligatures w14:val="none"/>
+              </w:rPr>
+              <w:t>0.67</w:t>
+            </w:r>
+          </w:p>
+        </w:tc>
+        <w:tc>
+          <w:tcPr>
+            <w:tcW w:w="1026" w:type="dxa"/>
+            <w:tcBorders>
+              <w:top w:val="nil"/>
+              <w:left w:val="nil"/>
+              <w:bottom w:val="single" w:sz="8" w:space="0" w:color="DADADA"/>
+              <w:right w:val="single" w:sz="8" w:space="0" w:color="DADADA"/>
+            </w:tcBorders>
+            <w:shd w:val="clear" w:color="000000" w:fill="FFFFFF"/>
+            <w:vAlign w:val="center"/>
+            <w:hideMark/>
+          </w:tcPr>
+          <w:p>
+            <w:pPr>
+              <w:spacing w:after="0" w:line="240" w:lineRule="auto"/>
+              <w:rPr>
+                <w:rFonts w:ascii="Open Sans" w:eastAsia="Times New Roman" w:hAnsi="Open Sans" w:cs="Open Sans"/>
+                <w:color w:val="212529"/>
+                <w:kern w:val="0"/>
+                <w:sz w:val="16"/>
+                <w:szCs w:val="16"/>
+                <w14:ligatures w14:val="none"/>
+              </w:rPr>
+            </w:pPr>
+            <w:r>
+              <w:rPr>
+                <w:rFonts w:ascii="Open Sans" w:eastAsia="Times New Roman" w:hAnsi="Open Sans" w:cs="Open Sans"/>
+                <w:color w:val="212529"/>
+                <w:kern w:val="0"/>
+                <w:sz w:val="16"/>
+                <w:szCs w:val="16"/>
+                <w14:ligatures w14:val="none"/>
+              </w:rPr>
+              <w:t>N/A</w:t>
+            </w:r>
+          </w:p>
+        </w:tc>
+      </w:tr>
+      <w:tr>
+        <w:trPr>
+          <w:trHeight w:val="970"/>
+        </w:trPr>
+        <w:tc>
+          <w:tcPr>
+            <w:tcW w:w="1876" w:type="dxa"/>
+            <w:tcBorders>
+              <w:top w:val="nil"/>
+              <w:left w:val="single" w:sz="8" w:space="0" w:color="DADADA"/>
+              <w:bottom w:val="single" w:sz="8" w:space="0" w:color="DADADA"/>
+              <w:right w:val="single" w:sz="8" w:space="0" w:color="DADADA"/>
+            </w:tcBorders>
+            <w:shd w:val="clear" w:color="000000" w:fill="FFFFFF"/>
+            <w:vAlign w:val="center"/>
+            <w:hideMark/>
+          </w:tcPr>
+          <w:p>
+            <w:pPr>
+              <w:spacing w:after="0" w:line="240" w:lineRule="auto"/>
+              <w:rPr>
+                <w:rFonts w:ascii="Open Sans" w:eastAsia="Times New Roman" w:hAnsi="Open Sans" w:cs="Open Sans"/>
+                <w:color w:val="212529"/>
+                <w:kern w:val="0"/>
+                <w:sz w:val="16"/>
+                <w:szCs w:val="16"/>
+                <w14:ligatures w14:val="none"/>
+              </w:rPr>
+            </w:pPr>
+            <w:proofErr w:type="spellStart"/>
+            <w:r>
+              <w:rPr>
+                <w:rFonts w:ascii="Open Sans" w:eastAsia="Times New Roman" w:hAnsi="Open Sans" w:cs="Open Sans"/>
+                <w:color w:val="212529"/>
+                <w:kern w:val="0"/>
+                <w:sz w:val="16"/>
+                <w:szCs w:val="16"/>
+                <w14:ligatures w14:val="none"/>
+              </w:rPr>
+              <w:t>mje_reserve</w:t>
+            </w:r>
+            <w:proofErr w:type="spellEnd"/>
+          </w:p>
+        </w:tc>
+        <w:tc>
+          <w:tcPr>
+            <w:tcW w:w="1140" w:type="dxa"/>
+            <w:tcBorders>
+              <w:top w:val="nil"/>
+              <w:left w:val="nil"/>
+              <w:bottom w:val="single" w:sz="8" w:space="0" w:color="DADADA"/>
+              <w:right w:val="single" w:sz="8" w:space="0" w:color="DADADA"/>
+            </w:tcBorders>
+            <w:shd w:val="clear" w:color="000000" w:fill="FFFFFF"/>
+            <w:vAlign w:val="center"/>
+            <w:hideMark/>
+          </w:tcPr>
+          <w:p>
+            <w:pPr>
+              <w:spacing w:after="0" w:line="240" w:lineRule="auto"/>
+              <w:rPr>
+                <w:rFonts w:ascii="Open Sans" w:eastAsia="Times New Roman" w:hAnsi="Open Sans" w:cs="Open Sans"/>
+                <w:color w:val="212529"/>
+                <w:kern w:val="0"/>
+                <w:sz w:val="16"/>
+                <w:szCs w:val="16"/>
+                <w14:ligatures w14:val="none"/>
+              </w:rPr>
+            </w:pPr>
+            <w:r>
+              <w:rPr>
+                <w:rFonts w:ascii="Open Sans" w:eastAsia="Times New Roman" w:hAnsi="Open Sans" w:cs="Open Sans"/>
+                <w:color w:val="212529"/>
+                <w:kern w:val="0"/>
+                <w:sz w:val="16"/>
+                <w:szCs w:val="16"/>
+                <w14:ligatures w14:val="none"/>
+              </w:rPr>
+              <w:t>Manual journal entry follow-up</w:t>
+            </w:r>
+          </w:p>
+        </w:tc>
+        <w:tc>
+          <w:tcPr>
+            <w:tcW w:w="948" w:type="dxa"/>
+            <w:tcBorders>
+              <w:top w:val="nil"/>
+              <w:left w:val="nil"/>
+              <w:bottom w:val="single" w:sz="8" w:space="0" w:color="DADADA"/>
+              <w:right w:val="single" w:sz="8" w:space="0" w:color="DADADA"/>
+            </w:tcBorders>
+            <w:shd w:val="clear" w:color="000000" w:fill="FFFFFF"/>
+            <w:vAlign w:val="center"/>
+            <w:hideMark/>
+          </w:tcPr>
+          <w:p>
+            <w:pPr>
+              <w:spacing w:after="0" w:line="240" w:lineRule="auto"/>
+              <w:jc w:val="right"/>
+              <w:rPr>
+                <w:rFonts w:ascii="Open Sans" w:eastAsia="Times New Roman" w:hAnsi="Open Sans" w:cs="Open Sans"/>
+                <w:color w:val="212529"/>
+                <w:kern w:val="0"/>
+                <w:sz w:val="16"/>
+                <w:szCs w:val="16"/>
+                <w14:ligatures w14:val="none"/>
+              </w:rPr>
+            </w:pPr>
+            <w:r>
+              <w:rPr>
+                <w:rFonts w:ascii="Open Sans" w:eastAsia="Times New Roman" w:hAnsi="Open Sans" w:cs="Open Sans"/>
+                <w:color w:val="212529"/>
+                <w:kern w:val="0"/>
+                <w:sz w:val="16"/>
+                <w:szCs w:val="16"/>
+                <w14:ligatures w14:val="none"/>
+              </w:rPr>
+              <w:t>1</w:t>
+            </w:r>
+          </w:p>
+        </w:tc>
+        <w:tc>
+          <w:tcPr>
+            <w:tcW w:w="849" w:type="dxa"/>
+            <w:tcBorders>
+              <w:top w:val="nil"/>
+              <w:left w:val="nil"/>
+              <w:bottom w:val="single" w:sz="8" w:space="0" w:color="DADADA"/>
+              <w:right w:val="single" w:sz="8" w:space="0" w:color="DADADA"/>
+            </w:tcBorders>
+            <w:shd w:val="clear" w:color="000000" w:fill="FFFFFF"/>
+            <w:vAlign w:val="center"/>
+            <w:hideMark/>
+          </w:tcPr>
+          <w:p>
+            <w:pPr>
+              <w:spacing w:after="0" w:line="240" w:lineRule="auto"/>
+              <w:jc w:val="right"/>
+              <w:rPr>
+                <w:rFonts w:ascii="Open Sans" w:eastAsia="Times New Roman" w:hAnsi="Open Sans" w:cs="Open Sans"/>
+                <w:color w:val="212529"/>
+                <w:kern w:val="0"/>
+                <w:sz w:val="16"/>
+                <w:szCs w:val="16"/>
+                <w14:ligatures w14:val="none"/>
+              </w:rPr>
+            </w:pPr>
+            <w:r>
+              <w:rPr>
+                <w:rFonts w:ascii="Open Sans" w:eastAsia="Times New Roman" w:hAnsi="Open Sans" w:cs="Open Sans"/>
+                <w:color w:val="212529"/>
+                <w:kern w:val="0"/>
+                <w:sz w:val="16"/>
+                <w:szCs w:val="16"/>
+                <w14:ligatures w14:val="none"/>
+              </w:rPr>
+              <w:t>1</w:t>
+            </w:r>
+          </w:p>
+        </w:tc>
+        <w:tc>
+          <w:tcPr>
+            <w:tcW w:w="1026" w:type="dxa"/>
+            <w:tcBorders>
+              <w:top w:val="nil"/>
+              <w:left w:val="nil"/>
+              <w:bottom w:val="single" w:sz="8" w:space="0" w:color="DADADA"/>
+              <w:right w:val="single" w:sz="8" w:space="0" w:color="DADADA"/>
+            </w:tcBorders>
+            <w:shd w:val="clear" w:color="000000" w:fill="FFFFFF"/>
+            <w:vAlign w:val="center"/>
+            <w:hideMark/>
+          </w:tcPr>
+          <w:p>
+            <w:pPr>
+              <w:spacing w:after="0" w:line="240" w:lineRule="auto"/>
+              <w:rPr>
+                <w:rFonts w:ascii="Open Sans" w:eastAsia="Times New Roman" w:hAnsi="Open Sans" w:cs="Open Sans"/>
+                <w:color w:val="212529"/>
+                <w:kern w:val="0"/>
+                <w:sz w:val="16"/>
+                <w:szCs w:val="16"/>
+                <w14:ligatures w14:val="none"/>
+              </w:rPr>
+            </w:pPr>
+            <w:r>
+              <w:rPr>
+                <w:rFonts w:ascii="Open Sans" w:eastAsia="Times New Roman" w:hAnsi="Open Sans" w:cs="Open Sans"/>
+                <w:color w:val="212529"/>
+                <w:kern w:val="0"/>
+                <w:sz w:val="16"/>
+                <w:szCs w:val="16"/>
+                <w14:ligatures w14:val="none"/>
+              </w:rPr>
+              <w:t>N/A</w:t>
+            </w:r>
+          </w:p>
+        </w:tc>
+      </w:tr>
+      <w:tr>
+        <w:trPr>
+          <w:trHeight w:val="730"/>
+        </w:trPr>
+        <w:tc>
+          <w:tcPr>
+            <w:tcW w:w="1876" w:type="dxa"/>
+            <w:tcBorders>
+              <w:top w:val="nil"/>
+              <w:left w:val="single" w:sz="8" w:space="0" w:color="DADADA"/>
+              <w:bottom w:val="single" w:sz="8" w:space="0" w:color="DADADA"/>
+              <w:right w:val="single" w:sz="8" w:space="0" w:color="DADADA"/>
+            </w:tcBorders>
+            <w:shd w:val="clear" w:color="000000" w:fill="FFFFFF"/>
+            <w:vAlign w:val="center"/>
+            <w:hideMark/>
+          </w:tcPr>
+          <w:p>
+            <w:pPr>
+              <w:spacing w:after="0" w:line="240" w:lineRule="auto"/>
+              <w:rPr>
+                <w:rFonts w:ascii="Open Sans" w:eastAsia="Times New Roman" w:hAnsi="Open Sans" w:cs="Open Sans"/>
+                <w:color w:val="212529"/>
+                <w:kern w:val="0"/>
+                <w:sz w:val="16"/>
+                <w:szCs w:val="16"/>
+                <w14:ligatures w14:val="none"/>
+              </w:rPr>
+            </w:pPr>
+            <w:proofErr w:type="spellStart"/>
+            <w:r>
+              <w:rPr>
+                <w:rFonts w:ascii="Open Sans" w:eastAsia="Times New Roman" w:hAnsi="Open Sans" w:cs="Open Sans"/>
+                <w:color w:val="212529"/>
+                <w:kern w:val="0"/>
+                <w:sz w:val="16"/>
+                <w:szCs w:val="16"/>
+                <w14:ligatures w14:val="none"/>
+              </w:rPr>
+              <w:t>audit_planning_memo</w:t>
+            </w:r>
+            <w:proofErr w:type="spellEnd"/>
+          </w:p>
+        </w:tc>
+        <w:tc>
+          <w:tcPr>
+            <w:tcW w:w="1140" w:type="dxa"/>
+            <w:tcBorders>
+              <w:top w:val="nil"/>
+              <w:left w:val="nil"/>
+              <w:bottom w:val="single" w:sz="8" w:space="0" w:color="DADADA"/>
+              <w:right w:val="single" w:sz="8" w:space="0" w:color="DADADA"/>
+            </w:tcBorders>
+            <w:shd w:val="clear" w:color="000000" w:fill="FFFFFF"/>
+            <w:vAlign w:val="center"/>
+            <w:hideMark/>
+          </w:tcPr>
+          <w:p>
+            <w:pPr>
+              <w:spacing w:after="0" w:line="240" w:lineRule="auto"/>
+              <w:rPr>
+                <w:rFonts w:ascii="Open Sans" w:eastAsia="Times New Roman" w:hAnsi="Open Sans" w:cs="Open Sans"/>
+                <w:color w:val="212529"/>
+                <w:kern w:val="0"/>
+                <w:sz w:val="16"/>
+                <w:szCs w:val="16"/>
+                <w14:ligatures w14:val="none"/>
+              </w:rPr>
+            </w:pPr>
+            <w:r>
+              <w:rPr>
+                <w:rFonts w:ascii="Open Sans" w:eastAsia="Times New Roman" w:hAnsi="Open Sans" w:cs="Open Sans"/>
+                <w:color w:val="212529"/>
+                <w:kern w:val="0"/>
+                <w:sz w:val="16"/>
+                <w:szCs w:val="16"/>
+                <w14:ligatures w14:val="none"/>
+              </w:rPr>
+              <w:t>Short planning memo</w:t>
+            </w:r>
+          </w:p>
+        </w:tc>
+        <w:tc>
+          <w:tcPr>
+            <w:tcW w:w="948" w:type="dxa"/>
+            <w:tcBorders>
+              <w:top w:val="nil"/>
+              <w:left w:val="nil"/>
+              <w:bottom w:val="single" w:sz="8" w:space="0" w:color="DADADA"/>
+              <w:right w:val="single" w:sz="8" w:space="0" w:color="DADADA"/>
+            </w:tcBorders>
+            <w:shd w:val="clear" w:color="000000" w:fill="FFFFFF"/>
+            <w:vAlign w:val="center"/>
+            <w:hideMark/>
+          </w:tcPr>
+          <w:p>
+            <w:pPr>
+              <w:spacing w:after="0" w:line="240" w:lineRule="auto"/>
+              <w:jc w:val="right"/>
+              <w:rPr>
+                <w:rFonts w:ascii="Open Sans" w:eastAsia="Times New Roman" w:hAnsi="Open Sans" w:cs="Open Sans"/>
+                <w:color w:val="212529"/>
+                <w:kern w:val="0"/>
+                <w:sz w:val="16"/>
+                <w:szCs w:val="16"/>
+                <w14:ligatures w14:val="none"/>
+              </w:rPr>
+            </w:pPr>
+            <w:r>
+              <w:rPr>
+                <w:rFonts w:ascii="Open Sans" w:eastAsia="Times New Roman" w:hAnsi="Open Sans" w:cs="Open Sans"/>
+                <w:color w:val="212529"/>
+                <w:kern w:val="0"/>
+                <w:sz w:val="16"/>
+                <w:szCs w:val="16"/>
+                <w14:ligatures w14:val="none"/>
+              </w:rPr>
+              <w:t>1</w:t>
+            </w:r>
+          </w:p>
+        </w:tc>
+        <w:tc>
+          <w:tcPr>
+            <w:tcW w:w="849" w:type="dxa"/>
+            <w:tcBorders>
+              <w:top w:val="nil"/>
+              <w:left w:val="nil"/>
+              <w:bottom w:val="single" w:sz="8" w:space="0" w:color="DADADA"/>
+              <w:right w:val="single" w:sz="8" w:space="0" w:color="DADADA"/>
+            </w:tcBorders>
+            <w:shd w:val="clear" w:color="000000" w:fill="FFFFFF"/>
+            <w:vAlign w:val="center"/>
+            <w:hideMark/>
+          </w:tcPr>
+          <w:p>
+            <w:pPr>
+              <w:spacing w:after="0" w:line="240" w:lineRule="auto"/>
+              <w:jc w:val="right"/>
+              <w:rPr>
+                <w:rFonts w:ascii="Open Sans" w:eastAsia="Times New Roman" w:hAnsi="Open Sans" w:cs="Open Sans"/>
+                <w:color w:val="212529"/>
+                <w:kern w:val="0"/>
+                <w:sz w:val="16"/>
+                <w:szCs w:val="16"/>
+                <w14:ligatures w14:val="none"/>
+              </w:rPr>
+            </w:pPr>
+            <w:r>
+              <w:rPr>
+                <w:rFonts w:ascii="Open Sans" w:eastAsia="Times New Roman" w:hAnsi="Open Sans" w:cs="Open Sans"/>
+                <w:color w:val="212529"/>
+                <w:kern w:val="0"/>
+                <w:sz w:val="16"/>
+                <w:szCs w:val="16"/>
+                <w14:ligatures w14:val="none"/>
+              </w:rPr>
+              <w:t>1</w:t>
+            </w:r>
+          </w:p>
+        </w:tc>
+        <w:tc>
+          <w:tcPr>
+            <w:tcW w:w="1026" w:type="dxa"/>
+            <w:tcBorders>
+              <w:top w:val="nil"/>
+              <w:left w:val="nil"/>
+              <w:bottom w:val="single" w:sz="8" w:space="0" w:color="DADADA"/>
+              <w:right w:val="single" w:sz="8" w:space="0" w:color="DADADA"/>
+            </w:tcBorders>
+            <w:shd w:val="clear" w:color="000000" w:fill="FFFFFF"/>
+            <w:vAlign w:val="center"/>
+            <w:hideMark/>
+          </w:tcPr>
+          <w:p>
+            <w:pPr>
+              <w:spacing w:after="0" w:line="240" w:lineRule="auto"/>
+              <w:rPr>
+                <w:rFonts w:ascii="Open Sans" w:eastAsia="Times New Roman" w:hAnsi="Open Sans" w:cs="Open Sans"/>
+                <w:color w:val="212529"/>
+                <w:kern w:val="0"/>
+                <w:sz w:val="16"/>
+                <w:szCs w:val="16"/>
+                <w14:ligatures w14:val="none"/>
+              </w:rPr>
+            </w:pPr>
+            <w:r>
+              <w:rPr>
+                <w:rFonts w:ascii="Open Sans" w:eastAsia="Times New Roman" w:hAnsi="Open Sans" w:cs="Open Sans"/>
+                <w:color w:val="212529"/>
+                <w:kern w:val="0"/>
+                <w:sz w:val="16"/>
+                <w:szCs w:val="16"/>
+                <w14:ligatures w14:val="none"/>
+              </w:rPr>
+              <w:t>N/A</w:t>
+            </w:r>
+          </w:p>
+        </w:tc>
+      </w:tr>
+    </w:tbl>
+    <w:p>
+      <w:pPr>
+        <w:spacing w:after="0" w:line="240" w:lineRule="auto"/>
+        <w:ind w:left="360"/>
         <w:rPr>
           <w:rFonts w:ascii="Times New Roman" w:eastAsia="Times New Roman" w:hAnsi="Times New Roman" w:cs="Times New Roman"/>
           <w:kern w:val="0"/>
           <w14:ligatures w14:val="none"/>
         </w:rPr>
-        <w:t xml:space="preserve">The Answer Relevancy metric was attempted, but in this notebook run it returned </w:t>
-      </w:r>
-      <w:proofErr w:type="spellStart"/>
-      <w:r>
+      </w:pPr>
+    </w:p>
+    <w:p>
+      <w:pPr>
+        <w:rPr>
+          <w:rFonts w:ascii="Times New Roman" w:eastAsia="Times New Roman" w:hAnsi="Times New Roman" w:cs="Times New Roman"/>
+          <w:b/>
+          <w:bCs/>
+          <w:kern w:val="0"/>
+          <w14:ligatures w14:val="none"/>
+        </w:rPr>
+      </w:pPr>
+      <w:r>
+        <w:rPr>
+          <w:rFonts w:ascii="Times New Roman" w:eastAsia="Times New Roman" w:hAnsi="Times New Roman" w:cs="Times New Roman"/>
+          <w:b/>
+          <w:bCs/>
+          <w:kern w:val="0"/>
+          <w14:ligatures w14:val="none"/>
+        </w:rPr>
+        <w:t>Baseline summary metrics</w:t>
+      </w:r>
+    </w:p>
+    <w:p>
+      <w:pPr>
+        <w:ind w:left="720"/>
         <w:rPr>
           <w:rFonts w:ascii="Times New Roman" w:eastAsia="Times New Roman" w:hAnsi="Times New Roman" w:cs="Times New Roman"/>
           <w:kern w:val="0"/>
           <w14:ligatures w14:val="none"/>
         </w:rPr>
-        <w:t>NaN</w:t>
-      </w:r>
-      <w:proofErr w:type="spellEnd"/>
+      </w:pPr>
+      <w:r>
+        <w:rPr>
+          <w:rFonts w:ascii="Times New Roman" w:eastAsia="Times New Roman" w:hAnsi="Times New Roman" w:cs="Times New Roman"/>
+          <w:b/>
+          <w:bCs/>
+          <w:kern w:val="0"/>
+          <w:u w:val="single"/>
+          <w14:ligatures w14:val="none"/>
+        </w:rPr>
+        <w:t>Average context precision:</w:t>
+      </w:r>
       <w:r>
         <w:rPr>
           <w:rFonts w:ascii="Times New Roman" w:eastAsia="Times New Roman" w:hAnsi="Times New Roman" w:cs="Times New Roman"/>
           <w:kern w:val="0"/>
           <w14:ligatures w14:val="none"/>
         </w:rPr>
-        <w:t xml:space="preserve"> due to evaluator incompatibility in the metric pipeline. Rather than reporting that as a valid score, I treated it as an unresolved measurement issue and relied on manual inspection of the generated outputs to judge whether the answers were complete and useful. Based on qualitative review, the responses were well grounded in the available source files and consistently produced structured, business-relevant outputs such as summaries and planning memos.</w:t>
-      </w:r>
-    </w:p>
-    <w:p>
-      <w:pPr>
-        <w:spacing w:after="0" w:line="240" w:lineRule="auto"/>
-        <w:ind w:left="360"/>
+        <w:t xml:space="preserve"> 1.00</w:t>
+      </w:r>
+    </w:p>
+    <w:p>
+      <w:pPr>
+        <w:ind w:left="720"/>
         <w:rPr>
           <w:rFonts w:ascii="Times New Roman" w:eastAsia="Times New Roman" w:hAnsi="Times New Roman" w:cs="Times New Roman"/>
           <w:kern w:val="0"/>
           <w14:ligatures w14:val="none"/>
         </w:rPr>
       </w:pPr>
-    </w:p>
-    <w:p>
-      <w:pPr>
-        <w:spacing w:after="0" w:line="240" w:lineRule="auto"/>
-        <w:ind w:left="360"/>
+      <w:r>
         <w:rPr>
           <w:rFonts w:ascii="Times New Roman" w:eastAsia="Times New Roman" w:hAnsi="Times New Roman" w:cs="Times New Roman"/>
           <w:b/>
@@ -1314,6 +3155,25 @@
           <w:u w:val="single"/>
           <w14:ligatures w14:val="none"/>
         </w:rPr>
+        <w:t xml:space="preserve">Average context recall: </w:t>
+      </w:r>
+      <w:r>
+        <w:rPr>
+          <w:rFonts w:ascii="Times New Roman" w:eastAsia="Times New Roman" w:hAnsi="Times New Roman" w:cs="Times New Roman"/>
+          <w:kern w:val="0"/>
+          <w14:ligatures w14:val="none"/>
+        </w:rPr>
+        <w:t>0.93</w:t>
+      </w:r>
+    </w:p>
+    <w:p>
+      <w:pPr>
+        <w:ind w:left="720"/>
+        <w:rPr>
+          <w:rFonts w:ascii="Times New Roman" w:eastAsia="Times New Roman" w:hAnsi="Times New Roman" w:cs="Times New Roman"/>
+          <w:kern w:val="0"/>
+          <w14:ligatures w14:val="none"/>
+        </w:rPr>
       </w:pPr>
       <w:r>
         <w:rPr>
@@ -1324,28 +3184,22 @@
           <w:u w:val="single"/>
           <w14:ligatures w14:val="none"/>
         </w:rPr>
-        <w:t>Baseline summary</w:t>
-      </w:r>
-    </w:p>
-    <w:p>
-      <w:pPr>
-        <w:spacing w:after="0" w:line="240" w:lineRule="auto"/>
-        <w:ind w:left="360"/>
+        <w:t>Answer relevancy:</w:t>
+      </w:r>
+      <w:r>
         <w:rPr>
           <w:rFonts w:ascii="Times New Roman" w:eastAsia="Times New Roman" w:hAnsi="Times New Roman" w:cs="Times New Roman"/>
           <w:kern w:val="0"/>
           <w14:ligatures w14:val="none"/>
         </w:rPr>
-      </w:pPr>
-    </w:p>
-    <w:p>
-      <w:pPr>
-        <w:spacing w:after="0" w:line="240" w:lineRule="auto"/>
-        <w:ind w:left="360"/>
+        <w:t xml:space="preserve"> not reliably captured in this notebook run</w:t>
+      </w:r>
+    </w:p>
+    <w:p>
+      <w:pPr>
+        <w:ind w:left="720"/>
         <w:rPr>
           <w:rFonts w:ascii="Times New Roman" w:eastAsia="Times New Roman" w:hAnsi="Times New Roman" w:cs="Times New Roman"/>
-          <w:b/>
-          <w:bCs/>
           <w:kern w:val="0"/>
           <w14:ligatures w14:val="none"/>
         </w:rPr>
@@ -1356,28 +3210,34 @@
           <w:b/>
           <w:bCs/>
           <w:kern w:val="0"/>
+          <w:u w:val="single"/>
           <w14:ligatures w14:val="none"/>
         </w:rPr>
-        <w:t>Citation relevance / retrieval precision: 1.00</w:t>
-      </w:r>
-    </w:p>
-    <w:p>
-      <w:pPr>
-        <w:spacing w:after="0" w:line="240" w:lineRule="auto"/>
-        <w:ind w:left="360"/>
+        <w:t>Qualitative reviewer assessment:</w:t>
+      </w:r>
+      <w:r>
         <w:rPr>
           <w:rFonts w:ascii="Times New Roman" w:eastAsia="Times New Roman" w:hAnsi="Times New Roman" w:cs="Times New Roman"/>
-          <w:b/>
-          <w:bCs/>
           <w:kern w:val="0"/>
           <w14:ligatures w14:val="none"/>
         </w:rPr>
-      </w:pPr>
-    </w:p>
-    <w:p>
-      <w:pPr>
-        <w:spacing w:after="0" w:line="240" w:lineRule="auto"/>
-        <w:ind w:left="360"/>
+        <w:t xml:space="preserve"> outputs were grounded, structured, and useful for audit-style workflows</w:t>
+      </w:r>
+    </w:p>
+    <w:p>
+      <w:pPr>
+        <w:rPr>
+          <w:rFonts w:ascii="Times New Roman" w:eastAsia="Times New Roman" w:hAnsi="Times New Roman" w:cs="Times New Roman"/>
+          <w:b/>
+          <w:bCs/>
+          <w:kern w:val="0"/>
+          <w:u w:val="single"/>
+          <w14:ligatures w14:val="none"/>
+        </w:rPr>
+      </w:pPr>
+    </w:p>
+    <w:p>
+      <w:pPr>
         <w:rPr>
           <w:rFonts w:ascii="Times New Roman" w:eastAsia="Times New Roman" w:hAnsi="Times New Roman" w:cs="Times New Roman"/>
           <w:b/>
@@ -1394,79 +3254,151 @@
           <w:kern w:val="0"/>
           <w14:ligatures w14:val="none"/>
         </w:rPr>
-        <w:t>Retrieval completeness / context recall: 0.93</w:t>
-      </w:r>
-    </w:p>
-    <w:p>
-      <w:pPr>
-        <w:spacing w:after="0" w:line="240" w:lineRule="auto"/>
-        <w:ind w:left="360"/>
+        <w:t>What these baseline results mean</w:t>
+      </w:r>
+    </w:p>
+    <w:p>
+      <w:pPr>
         <w:rPr>
           <w:rFonts w:ascii="Times New Roman" w:eastAsia="Times New Roman" w:hAnsi="Times New Roman" w:cs="Times New Roman"/>
-          <w:b/>
-          <w:bCs/>
           <w:kern w:val="0"/>
           <w14:ligatures w14:val="none"/>
         </w:rPr>
       </w:pPr>
-    </w:p>
-    <w:p>
-      <w:pPr>
-        <w:spacing w:after="0" w:line="240" w:lineRule="auto"/>
-        <w:ind w:left="360"/>
+      <w:r>
         <w:rPr>
           <w:rFonts w:ascii="Times New Roman" w:eastAsia="Times New Roman" w:hAnsi="Times New Roman" w:cs="Times New Roman"/>
-          <w:b/>
-          <w:bCs/>
           <w:kern w:val="0"/>
           <w14:ligatures w14:val="none"/>
         </w:rPr>
-      </w:pPr>
-      <w:r>
+        <w:t>The baseline retriever is already very strong on precision. Every retrieved context set was relevant to the user’s query, which is especially important for a professional workflow where irrelevant evidence can create reviewer burden and reduce trust. In other words, the system is already good at avoiding “AI slop” at the retrieval layer.</w:t>
+      </w:r>
+    </w:p>
+    <w:p>
+      <w:pPr>
         <w:rPr>
           <w:rFonts w:ascii="Times New Roman" w:eastAsia="Times New Roman" w:hAnsi="Times New Roman" w:cs="Times New Roman"/>
-          <w:b/>
-          <w:bCs/>
           <w:kern w:val="0"/>
           <w14:ligatures w14:val="none"/>
         </w:rPr>
-        <w:t>Answer completeness: not reliably captured by automatic scoring in this run</w:t>
-      </w:r>
-    </w:p>
-    <w:p>
-      <w:pPr>
-        <w:spacing w:after="0" w:line="240" w:lineRule="auto"/>
-        <w:ind w:left="360"/>
+      </w:pPr>
+    </w:p>
+    <w:p>
+      <w:pPr>
         <w:rPr>
           <w:rFonts w:ascii="Times New Roman" w:eastAsia="Times New Roman" w:hAnsi="Times New Roman" w:cs="Times New Roman"/>
-          <w:b/>
-          <w:bCs/>
           <w:kern w:val="0"/>
           <w14:ligatures w14:val="none"/>
         </w:rPr>
       </w:pPr>
-    </w:p>
-    <w:p>
-      <w:pPr>
-        <w:spacing w:after="0" w:line="240" w:lineRule="auto"/>
-        <w:ind w:left="360"/>
+      <w:r>
         <w:rPr>
           <w:rFonts w:ascii="Times New Roman" w:eastAsia="Times New Roman" w:hAnsi="Times New Roman" w:cs="Times New Roman"/>
-          <w:b/>
-          <w:bCs/>
           <w:kern w:val="0"/>
           <w14:ligatures w14:val="none"/>
         </w:rPr>
-      </w:pPr>
+        <w:t xml:space="preserve">The main weakness in the baseline appears in the control and audit risk areas case, where context recall dropped to 0.67. This suggests that the retriever is strong at bringing back relevant </w:t>
+      </w:r>
       <w:r>
         <w:rPr>
           <w:rFonts w:ascii="Times New Roman" w:eastAsia="Times New Roman" w:hAnsi="Times New Roman" w:cs="Times New Roman"/>
-          <w:b/>
-          <w:bCs/>
           <w:kern w:val="0"/>
           <w14:ligatures w14:val="none"/>
         </w:rPr>
-        <w:t>Qualitative outcome: generated outputs were grounded, structured, and useful for audit-style workflows</w:t>
+        <w:t>evidence but</w:t>
+      </w:r>
+      <w:r>
+        <w:rPr>
+          <w:rFonts w:ascii="Times New Roman" w:eastAsia="Times New Roman" w:hAnsi="Times New Roman" w:cs="Times New Roman"/>
+          <w:kern w:val="0"/>
+          <w14:ligatures w14:val="none"/>
+        </w:rPr>
+        <w:t xml:space="preserve"> may still miss some supporting evidence when the task requires synthesizing risk </w:t>
+      </w:r>
+      <w:r>
+        <w:rPr>
+          <w:rFonts w:ascii="Times New Roman" w:eastAsia="Times New Roman" w:hAnsi="Times New Roman" w:cs="Times New Roman"/>
+          <w:kern w:val="0"/>
+          <w14:ligatures w14:val="none"/>
+        </w:rPr>
+        <w:lastRenderedPageBreak/>
+        <w:t>signals across multiple documents. That is exactly the kind of failure mode that matters for audit planning, where incomplete evidence can be more dangerous than slightly noisy evidence.</w:t>
+      </w:r>
+    </w:p>
+    <w:p>
+      <w:pPr>
+        <w:rPr>
+          <w:rFonts w:ascii="Times New Roman" w:eastAsia="Times New Roman" w:hAnsi="Times New Roman" w:cs="Times New Roman"/>
+          <w:b/>
+          <w:bCs/>
+          <w:kern w:val="0"/>
+          <w:u w:val="single"/>
+          <w14:ligatures w14:val="none"/>
+        </w:rPr>
+      </w:pPr>
+    </w:p>
+    <w:p>
+      <w:pPr>
+        <w:rPr>
+          <w:rFonts w:ascii="Times New Roman" w:eastAsia="Times New Roman" w:hAnsi="Times New Roman" w:cs="Times New Roman"/>
+          <w:b/>
+          <w:bCs/>
+          <w:kern w:val="0"/>
+          <w14:ligatures w14:val="none"/>
+        </w:rPr>
+      </w:pPr>
+      <w:r>
+        <w:rPr>
+          <w:rFonts w:ascii="Times New Roman" w:eastAsia="Times New Roman" w:hAnsi="Times New Roman" w:cs="Times New Roman"/>
+          <w:b/>
+          <w:bCs/>
+          <w:kern w:val="0"/>
+          <w14:ligatures w14:val="none"/>
+        </w:rPr>
+        <w:t>Conclusions about performance and effectiveness</w:t>
+      </w:r>
+    </w:p>
+    <w:p>
+      <w:pPr>
+        <w:rPr>
+          <w:rFonts w:ascii="Times New Roman" w:eastAsia="Times New Roman" w:hAnsi="Times New Roman" w:cs="Times New Roman"/>
+          <w:kern w:val="0"/>
+          <w14:ligatures w14:val="none"/>
+        </w:rPr>
+      </w:pPr>
+      <w:r>
+        <w:rPr>
+          <w:rFonts w:ascii="Times New Roman" w:eastAsia="Times New Roman" w:hAnsi="Times New Roman" w:cs="Times New Roman"/>
+          <w:kern w:val="0"/>
+          <w14:ligatures w14:val="none"/>
+        </w:rPr>
+        <w:t>These results suggest that the current baseline is already effective for an MVP focused on audit workpaper adaptation. The retrieval layer is reliable enough to support grounded artifact generation, and the prototype consistently produced useful summaries and planning outputs. The strongest evidence for effectiveness is that the system was able to retrieve relevant context, preserve citations, generate structured audit outputs, and save those outputs as reusable reports.</w:t>
+      </w:r>
+    </w:p>
+    <w:p>
+      <w:pPr>
+        <w:rPr>
+          <w:rFonts w:ascii="Times New Roman" w:eastAsia="Times New Roman" w:hAnsi="Times New Roman" w:cs="Times New Roman"/>
+          <w:kern w:val="0"/>
+          <w14:ligatures w14:val="none"/>
+        </w:rPr>
+      </w:pPr>
+    </w:p>
+    <w:p>
+      <w:pPr>
+        <w:rPr>
+          <w:rFonts w:ascii="Times New Roman" w:eastAsia="Times New Roman" w:hAnsi="Times New Roman" w:cs="Times New Roman"/>
+          <w:kern w:val="0"/>
+          <w14:ligatures w14:val="none"/>
+        </w:rPr>
+      </w:pPr>
+      <w:r>
+        <w:rPr>
+          <w:rFonts w:ascii="Times New Roman" w:eastAsia="Times New Roman" w:hAnsi="Times New Roman" w:cs="Times New Roman"/>
+          <w:kern w:val="0"/>
+          <w14:ligatures w14:val="none"/>
+        </w:rPr>
+        <w:t>At the same time, the baseline results also justify a retriever upgrade. The lower recall on the multi-source risk question indicates that while the system is already precise, it still has room to improve coverage on more synthesis-heavy audit prompts. That makes the retriever improvement exercise meaningful rather than artificial.</w:t>
       </w:r>
     </w:p>
     <w:p/>
@@ -1482,27 +3414,1126 @@
           <w:b/>
           <w:bCs/>
         </w:rPr>
-        <w:t>6. Retriever Upgrade</w:t>
-      </w:r>
-    </w:p>
-    <w:p>
-      <w:r>
-        <w:t xml:space="preserve"> The baseline retriever was already strong, with perfect context precision and high average recall. However, one synthesis-heavy prompt scored lower on recall, suggesting some supporting evidence was </w:t>
-      </w:r>
-      <w:r>
-        <w:t>missing</w:t>
-      </w:r>
-      <w:r>
-        <w:t>. To address this, I tested a lightweight retriever upgrade aimed at improving coverage for multi-source audit questions. The upgrade produced only modest gains, which indicates that the baseline retriever is already a strong fit for this MVP. For this reason, I would keep the simpler baseline configuration for now and reserve more complex retrieval techniques for future iterations.</w:t>
-      </w:r>
-    </w:p>
-    <w:p>
-      <w:pPr>
-        <w:rPr>
-          <w:b/>
-          <w:bCs/>
-        </w:rPr>
-      </w:pPr>
+        <w:t>6a. Chosen advanced retrieval technique</w:t>
+      </w:r>
+    </w:p>
+    <w:p>
+      <w:r>
+        <w:t>For the retriever upgrade, I implemented Maximal Marginal Relevance (MMR) retrieval. I chose MMR because the baseline retriever was already extremely strong on citation precision, but it still showed weaker recall on at least one more synthesis-heavy audit prompt. That suggested the baseline system was already good at retrieving relevant chunks, but not always good enough at retrieving a diverse enough evidence set when the answer depended on multiple sources. MMR is useful in this situation because it balances relevance with diversity, which helps reduce redundancy in retrieved chunks and increases the chance of covering multiple source files in a single response.</w:t>
+      </w:r>
+    </w:p>
+    <w:p>
+      <w:r>
+        <w:t xml:space="preserve">This is a particularly good fit for </w:t>
+      </w:r>
+      <w:proofErr w:type="spellStart"/>
+      <w:r>
+        <w:t>SwarmMate</w:t>
+      </w:r>
+      <w:proofErr w:type="spellEnd"/>
+      <w:r>
+        <w:t xml:space="preserve"> because many audit and planning tasks are not single-document lookups. For example, an audit planning memo may need information from control notes, client background, open request lists, and the trial balance at the same time. A plain dense top-k retriever can sometimes over-focus on one highly similar source, while MMR can improve coverage by surfacing a broader mix of evidence across the document set.</w:t>
+      </w:r>
+    </w:p>
+    <w:p>
+      <w:pPr>
+        <w:rPr>
+          <w:b/>
+          <w:bCs/>
+        </w:rPr>
+      </w:pPr>
+    </w:p>
+    <w:p>
+      <w:pPr>
+        <w:rPr>
+          <w:b/>
+          <w:bCs/>
+        </w:rPr>
+      </w:pPr>
+    </w:p>
+    <w:p>
+      <w:pPr>
+        <w:rPr>
+          <w:b/>
+          <w:bCs/>
+        </w:rPr>
+      </w:pPr>
+    </w:p>
+    <w:p>
+      <w:pPr>
+        <w:rPr>
+          <w:b/>
+          <w:bCs/>
+        </w:rPr>
+      </w:pPr>
+      <w:r>
+        <w:rPr>
+          <w:b/>
+          <w:bCs/>
+        </w:rPr>
+        <w:lastRenderedPageBreak/>
+        <w:t>6b. Implementation of the advanced retrieval technique</w:t>
+      </w:r>
+    </w:p>
+    <w:p>
+      <w:r>
+        <w:t xml:space="preserve">I implemented the retriever upgrade by modifying the retrieval layer in app/rag.py. The baseline system used standard dense vector similarity search over the </w:t>
+      </w:r>
+      <w:proofErr w:type="spellStart"/>
+      <w:r>
+        <w:t>Qdrant</w:t>
+      </w:r>
+      <w:proofErr w:type="spellEnd"/>
+      <w:r>
+        <w:t xml:space="preserve"> vector store. In the upgraded version, I introduced a configurable retrieval mode and switched the retriever to MMR-based retrieval. This kept the same embedding model, same vector store, and same overall RAG pipeline, but changed the retrieval strategy so that chunks were selected based not only on semantic similarity, but also on diversity relative to one another.</w:t>
+      </w:r>
+    </w:p>
+    <w:p>
+      <w:r>
+        <w:t>The purpose of this implementation was to make the experiment targeted and interpretable. I did not want to change multiple parts of the system at once, because then it would be hard to tell what caused the performance difference. By holding the rest of the stack constant and only changing the retriever strategy, I was able to isolate the effect of MMR more clearly.</w:t>
+      </w:r>
+    </w:p>
+    <w:p>
+      <w:pPr>
+        <w:rPr>
+          <w:b/>
+          <w:bCs/>
+        </w:rPr>
+      </w:pPr>
+      <w:r>
+        <w:rPr>
+          <w:b/>
+          <w:bCs/>
+        </w:rPr>
+        <w:t>6c. Performance comparison against the original RAG application</w:t>
+      </w:r>
+    </w:p>
+    <w:p>
+      <w:r>
+        <w:t>I evaluated the original baseline retriever and the upgraded MMR retriever using the same synthetic audit-style evaluation set. The comparison focused on two stable Ragas metrics from the notebook environment:</w:t>
+      </w:r>
+    </w:p>
+    <w:p>
+      <w:pPr>
+        <w:pStyle w:val="ListParagraph"/>
+        <w:numPr>
+          <w:ilvl w:val="0"/>
+          <w:numId w:val="18"/>
+        </w:numPr>
+      </w:pPr>
+      <w:r>
+        <w:t>LLM Context Precision with Reference, which captures how relevant the retrieved chunks are to the prompt</w:t>
+      </w:r>
+    </w:p>
+    <w:p>
+      <w:pPr>
+        <w:pStyle w:val="ListParagraph"/>
+        <w:numPr>
+          <w:ilvl w:val="0"/>
+          <w:numId w:val="18"/>
+        </w:numPr>
+      </w:pPr>
+      <w:r>
+        <w:t>Context Recall, which captures how completely the retrieved chunks cover the reference evidence needed for the answer</w:t>
+      </w:r>
+    </w:p>
+    <w:p/>
+    <w:p>
+      <w:pPr>
+        <w:rPr>
+          <w:b/>
+          <w:bCs/>
+          <w:u w:val="single"/>
+        </w:rPr>
+      </w:pPr>
+      <w:r>
+        <w:rPr>
+          <w:b/>
+          <w:bCs/>
+          <w:u w:val="single"/>
+        </w:rPr>
+        <w:t>Before / after comparison table</w:t>
+      </w:r>
+    </w:p>
+    <w:tbl>
+      <w:tblPr>
+        <w:tblW w:w="11650" w:type="dxa"/>
+        <w:shd w:val="clear" w:color="auto" w:fill="FFFFFF"/>
+        <w:tblCellMar>
+          <w:top w:w="15" w:type="dxa"/>
+          <w:left w:w="15" w:type="dxa"/>
+          <w:bottom w:w="15" w:type="dxa"/>
+          <w:right w:w="15" w:type="dxa"/>
+        </w:tblCellMar>
+        <w:tblLook w:val="04A0" w:firstRow="1" w:lastRow="0" w:firstColumn="1" w:lastColumn="0" w:noHBand="0" w:noVBand="1"/>
+      </w:tblPr>
+      <w:tblGrid>
+        <w:gridCol w:w="1882"/>
+        <w:gridCol w:w="2520"/>
+        <w:gridCol w:w="2430"/>
+        <w:gridCol w:w="4818"/>
+      </w:tblGrid>
+      <w:tr>
+        <w:trPr>
+          <w:tblHeader/>
+        </w:trPr>
+        <w:tc>
+          <w:tcPr>
+            <w:tcW w:w="1882" w:type="dxa"/>
+            <w:tcBorders>
+              <w:top w:val="single" w:sz="6" w:space="0" w:color="FCFCFC"/>
+              <w:left w:val="single" w:sz="6" w:space="0" w:color="FCFCFC"/>
+              <w:bottom w:val="single" w:sz="6" w:space="0" w:color="FCFCFC"/>
+              <w:right w:val="single" w:sz="6" w:space="0" w:color="FCFCFC"/>
+            </w:tcBorders>
+            <w:shd w:val="clear" w:color="auto" w:fill="DADADA"/>
+            <w:tcMar>
+              <w:top w:w="120" w:type="dxa"/>
+              <w:left w:w="120" w:type="dxa"/>
+              <w:bottom w:w="120" w:type="dxa"/>
+              <w:right w:w="120" w:type="dxa"/>
+            </w:tcMar>
+            <w:vAlign w:val="center"/>
+            <w:hideMark/>
+          </w:tcPr>
+          <w:p>
+            <w:pPr>
+              <w:rPr>
+                <w:b/>
+                <w:bCs/>
+              </w:rPr>
+            </w:pPr>
+            <w:r>
+              <w:rPr>
+                <w:b/>
+                <w:bCs/>
+              </w:rPr>
+              <w:t>Metric</w:t>
+            </w:r>
+          </w:p>
+        </w:tc>
+        <w:tc>
+          <w:tcPr>
+            <w:tcW w:w="2520" w:type="dxa"/>
+            <w:tcBorders>
+              <w:top w:val="single" w:sz="6" w:space="0" w:color="FCFCFC"/>
+              <w:left w:val="single" w:sz="6" w:space="0" w:color="FCFCFC"/>
+              <w:bottom w:val="single" w:sz="6" w:space="0" w:color="FCFCFC"/>
+              <w:right w:val="single" w:sz="6" w:space="0" w:color="FCFCFC"/>
+            </w:tcBorders>
+            <w:shd w:val="clear" w:color="auto" w:fill="DADADA"/>
+            <w:tcMar>
+              <w:top w:w="120" w:type="dxa"/>
+              <w:left w:w="120" w:type="dxa"/>
+              <w:bottom w:w="120" w:type="dxa"/>
+              <w:right w:w="120" w:type="dxa"/>
+            </w:tcMar>
+            <w:vAlign w:val="center"/>
+            <w:hideMark/>
+          </w:tcPr>
+          <w:p>
+            <w:pPr>
+              <w:rPr>
+                <w:b/>
+                <w:bCs/>
+              </w:rPr>
+            </w:pPr>
+            <w:r>
+              <w:rPr>
+                <w:b/>
+                <w:bCs/>
+              </w:rPr>
+              <w:t>Baseline Similarity</w:t>
+            </w:r>
+          </w:p>
+        </w:tc>
+        <w:tc>
+          <w:tcPr>
+            <w:tcW w:w="2430" w:type="dxa"/>
+            <w:tcBorders>
+              <w:top w:val="single" w:sz="6" w:space="0" w:color="FCFCFC"/>
+              <w:left w:val="single" w:sz="6" w:space="0" w:color="FCFCFC"/>
+              <w:bottom w:val="single" w:sz="6" w:space="0" w:color="FCFCFC"/>
+              <w:right w:val="single" w:sz="6" w:space="0" w:color="FCFCFC"/>
+            </w:tcBorders>
+            <w:shd w:val="clear" w:color="auto" w:fill="DADADA"/>
+            <w:tcMar>
+              <w:top w:w="120" w:type="dxa"/>
+              <w:left w:w="120" w:type="dxa"/>
+              <w:bottom w:w="120" w:type="dxa"/>
+              <w:right w:w="120" w:type="dxa"/>
+            </w:tcMar>
+            <w:vAlign w:val="center"/>
+            <w:hideMark/>
+          </w:tcPr>
+          <w:p>
+            <w:pPr>
+              <w:rPr>
+                <w:b/>
+                <w:bCs/>
+              </w:rPr>
+            </w:pPr>
+            <w:r>
+              <w:rPr>
+                <w:b/>
+                <w:bCs/>
+              </w:rPr>
+              <w:t>Upgraded MMR</w:t>
+            </w:r>
+          </w:p>
+        </w:tc>
+        <w:tc>
+          <w:tcPr>
+            <w:tcW w:w="4818" w:type="dxa"/>
+            <w:tcBorders>
+              <w:top w:val="single" w:sz="6" w:space="0" w:color="FCFCFC"/>
+              <w:left w:val="single" w:sz="6" w:space="0" w:color="FCFCFC"/>
+              <w:bottom w:val="single" w:sz="6" w:space="0" w:color="FCFCFC"/>
+              <w:right w:val="single" w:sz="6" w:space="0" w:color="FCFCFC"/>
+            </w:tcBorders>
+            <w:shd w:val="clear" w:color="auto" w:fill="DADADA"/>
+            <w:tcMar>
+              <w:top w:w="120" w:type="dxa"/>
+              <w:left w:w="120" w:type="dxa"/>
+              <w:bottom w:w="120" w:type="dxa"/>
+              <w:right w:w="120" w:type="dxa"/>
+            </w:tcMar>
+            <w:vAlign w:val="center"/>
+            <w:hideMark/>
+          </w:tcPr>
+          <w:p>
+            <w:pPr>
+              <w:rPr>
+                <w:b/>
+                <w:bCs/>
+              </w:rPr>
+            </w:pPr>
+            <w:r>
+              <w:rPr>
+                <w:b/>
+                <w:bCs/>
+              </w:rPr>
+              <w:t>Change</w:t>
+            </w:r>
+          </w:p>
+        </w:tc>
+      </w:tr>
+      <w:tr>
+        <w:tc>
+          <w:tcPr>
+            <w:tcW w:w="1882" w:type="dxa"/>
+            <w:tcBorders>
+              <w:top w:val="single" w:sz="6" w:space="0" w:color="DADADA"/>
+              <w:left w:val="single" w:sz="6" w:space="0" w:color="DADADA"/>
+              <w:bottom w:val="single" w:sz="6" w:space="0" w:color="DADADA"/>
+              <w:right w:val="single" w:sz="6" w:space="0" w:color="DADADA"/>
+            </w:tcBorders>
+            <w:shd w:val="clear" w:color="auto" w:fill="FFFFFF"/>
+            <w:tcMar>
+              <w:top w:w="120" w:type="dxa"/>
+              <w:left w:w="120" w:type="dxa"/>
+              <w:bottom w:w="120" w:type="dxa"/>
+              <w:right w:w="120" w:type="dxa"/>
+            </w:tcMar>
+            <w:vAlign w:val="center"/>
+            <w:hideMark/>
+          </w:tcPr>
+          <w:p>
+            <w:r>
+              <w:t>Context Precision</w:t>
+            </w:r>
+          </w:p>
+        </w:tc>
+        <w:tc>
+          <w:tcPr>
+            <w:tcW w:w="2520" w:type="dxa"/>
+            <w:tcBorders>
+              <w:top w:val="single" w:sz="6" w:space="0" w:color="DADADA"/>
+              <w:left w:val="single" w:sz="6" w:space="0" w:color="DADADA"/>
+              <w:bottom w:val="single" w:sz="6" w:space="0" w:color="DADADA"/>
+              <w:right w:val="single" w:sz="6" w:space="0" w:color="DADADA"/>
+            </w:tcBorders>
+            <w:shd w:val="clear" w:color="auto" w:fill="FFFFFF"/>
+            <w:tcMar>
+              <w:top w:w="120" w:type="dxa"/>
+              <w:left w:w="120" w:type="dxa"/>
+              <w:bottom w:w="120" w:type="dxa"/>
+              <w:right w:w="120" w:type="dxa"/>
+            </w:tcMar>
+            <w:vAlign w:val="center"/>
+            <w:hideMark/>
+          </w:tcPr>
+          <w:p>
+            <w:r>
+              <w:t>1.000</w:t>
+            </w:r>
+          </w:p>
+        </w:tc>
+        <w:tc>
+          <w:tcPr>
+            <w:tcW w:w="2430" w:type="dxa"/>
+            <w:tcBorders>
+              <w:top w:val="single" w:sz="6" w:space="0" w:color="DADADA"/>
+              <w:left w:val="single" w:sz="6" w:space="0" w:color="DADADA"/>
+              <w:bottom w:val="single" w:sz="6" w:space="0" w:color="DADADA"/>
+              <w:right w:val="single" w:sz="6" w:space="0" w:color="DADADA"/>
+            </w:tcBorders>
+            <w:shd w:val="clear" w:color="auto" w:fill="FFFFFF"/>
+            <w:tcMar>
+              <w:top w:w="120" w:type="dxa"/>
+              <w:left w:w="120" w:type="dxa"/>
+              <w:bottom w:w="120" w:type="dxa"/>
+              <w:right w:w="120" w:type="dxa"/>
+            </w:tcMar>
+            <w:vAlign w:val="center"/>
+            <w:hideMark/>
+          </w:tcPr>
+          <w:p>
+            <w:r>
+              <w:t>0.922</w:t>
+            </w:r>
+          </w:p>
+        </w:tc>
+        <w:tc>
+          <w:tcPr>
+            <w:tcW w:w="4818" w:type="dxa"/>
+            <w:tcBorders>
+              <w:top w:val="single" w:sz="6" w:space="0" w:color="DADADA"/>
+              <w:left w:val="single" w:sz="6" w:space="0" w:color="DADADA"/>
+              <w:bottom w:val="single" w:sz="6" w:space="0" w:color="DADADA"/>
+              <w:right w:val="single" w:sz="6" w:space="0" w:color="DADADA"/>
+            </w:tcBorders>
+            <w:shd w:val="clear" w:color="auto" w:fill="FFFFFF"/>
+            <w:tcMar>
+              <w:top w:w="120" w:type="dxa"/>
+              <w:left w:w="120" w:type="dxa"/>
+              <w:bottom w:w="120" w:type="dxa"/>
+              <w:right w:w="120" w:type="dxa"/>
+            </w:tcMar>
+            <w:vAlign w:val="center"/>
+            <w:hideMark/>
+          </w:tcPr>
+          <w:p>
+            <w:pPr>
+              <w:rPr>
+                <w:b/>
+                <w:bCs/>
+              </w:rPr>
+            </w:pPr>
+            <w:r>
+              <w:rPr>
+                <w:b/>
+                <w:bCs/>
+                <w:color w:val="FF0000"/>
+              </w:rPr>
+              <w:t>-0.078</w:t>
+            </w:r>
+          </w:p>
+        </w:tc>
+      </w:tr>
+      <w:tr>
+        <w:tc>
+          <w:tcPr>
+            <w:tcW w:w="1882" w:type="dxa"/>
+            <w:tcBorders>
+              <w:top w:val="single" w:sz="6" w:space="0" w:color="DADADA"/>
+              <w:left w:val="single" w:sz="6" w:space="0" w:color="DADADA"/>
+              <w:bottom w:val="single" w:sz="6" w:space="0" w:color="DADADA"/>
+              <w:right w:val="single" w:sz="6" w:space="0" w:color="DADADA"/>
+            </w:tcBorders>
+            <w:shd w:val="clear" w:color="auto" w:fill="FFFFFF"/>
+            <w:tcMar>
+              <w:top w:w="120" w:type="dxa"/>
+              <w:left w:w="120" w:type="dxa"/>
+              <w:bottom w:w="120" w:type="dxa"/>
+              <w:right w:w="120" w:type="dxa"/>
+            </w:tcMar>
+            <w:vAlign w:val="center"/>
+            <w:hideMark/>
+          </w:tcPr>
+          <w:p>
+            <w:r>
+              <w:t>Context Recall</w:t>
+            </w:r>
+          </w:p>
+        </w:tc>
+        <w:tc>
+          <w:tcPr>
+            <w:tcW w:w="2520" w:type="dxa"/>
+            <w:tcBorders>
+              <w:top w:val="single" w:sz="6" w:space="0" w:color="DADADA"/>
+              <w:left w:val="single" w:sz="6" w:space="0" w:color="DADADA"/>
+              <w:bottom w:val="single" w:sz="6" w:space="0" w:color="DADADA"/>
+              <w:right w:val="single" w:sz="6" w:space="0" w:color="DADADA"/>
+            </w:tcBorders>
+            <w:shd w:val="clear" w:color="auto" w:fill="FFFFFF"/>
+            <w:tcMar>
+              <w:top w:w="120" w:type="dxa"/>
+              <w:left w:w="120" w:type="dxa"/>
+              <w:bottom w:w="120" w:type="dxa"/>
+              <w:right w:w="120" w:type="dxa"/>
+            </w:tcMar>
+            <w:vAlign w:val="center"/>
+            <w:hideMark/>
+          </w:tcPr>
+          <w:p>
+            <w:r>
+              <w:t>0.800</w:t>
+            </w:r>
+          </w:p>
+        </w:tc>
+        <w:tc>
+          <w:tcPr>
+            <w:tcW w:w="2430" w:type="dxa"/>
+            <w:tcBorders>
+              <w:top w:val="single" w:sz="6" w:space="0" w:color="DADADA"/>
+              <w:left w:val="single" w:sz="6" w:space="0" w:color="DADADA"/>
+              <w:bottom w:val="single" w:sz="6" w:space="0" w:color="DADADA"/>
+              <w:right w:val="single" w:sz="6" w:space="0" w:color="DADADA"/>
+            </w:tcBorders>
+            <w:shd w:val="clear" w:color="auto" w:fill="FFFFFF"/>
+            <w:tcMar>
+              <w:top w:w="120" w:type="dxa"/>
+              <w:left w:w="120" w:type="dxa"/>
+              <w:bottom w:w="120" w:type="dxa"/>
+              <w:right w:w="120" w:type="dxa"/>
+            </w:tcMar>
+            <w:vAlign w:val="center"/>
+            <w:hideMark/>
+          </w:tcPr>
+          <w:p>
+            <w:r>
+              <w:t>1.000</w:t>
+            </w:r>
+          </w:p>
+        </w:tc>
+        <w:tc>
+          <w:tcPr>
+            <w:tcW w:w="4818" w:type="dxa"/>
+            <w:tcBorders>
+              <w:top w:val="single" w:sz="6" w:space="0" w:color="DADADA"/>
+              <w:left w:val="single" w:sz="6" w:space="0" w:color="DADADA"/>
+              <w:bottom w:val="single" w:sz="6" w:space="0" w:color="DADADA"/>
+              <w:right w:val="single" w:sz="6" w:space="0" w:color="DADADA"/>
+            </w:tcBorders>
+            <w:shd w:val="clear" w:color="auto" w:fill="FFFFFF"/>
+            <w:tcMar>
+              <w:top w:w="120" w:type="dxa"/>
+              <w:left w:w="120" w:type="dxa"/>
+              <w:bottom w:w="120" w:type="dxa"/>
+              <w:right w:w="120" w:type="dxa"/>
+            </w:tcMar>
+            <w:vAlign w:val="center"/>
+            <w:hideMark/>
+          </w:tcPr>
+          <w:p>
+            <w:pPr>
+              <w:rPr>
+                <w:b/>
+                <w:bCs/>
+              </w:rPr>
+            </w:pPr>
+            <w:r>
+              <w:rPr>
+                <w:b/>
+                <w:bCs/>
+                <w:color w:val="00B050"/>
+              </w:rPr>
+              <w:t>+0.200</w:t>
+            </w:r>
+          </w:p>
+        </w:tc>
+      </w:tr>
+    </w:tbl>
+    <w:p/>
+    <w:p/>
+    <w:p>
+      <w:pPr>
+        <w:rPr>
+          <w:b/>
+          <w:bCs/>
+        </w:rPr>
+      </w:pPr>
+      <w:r>
+        <w:lastRenderedPageBreak/>
+        <w:br/>
+      </w:r>
+      <w:r>
+        <w:rPr>
+          <w:b/>
+          <w:bCs/>
+        </w:rPr>
+        <w:t>Per-case upgraded MMR results</w:t>
+      </w:r>
+      <w:r>
+        <w:rPr>
+          <w:b/>
+          <w:bCs/>
+        </w:rPr>
+        <w:t>:</w:t>
+      </w:r>
+    </w:p>
+    <w:tbl>
+      <w:tblPr>
+        <w:tblW w:w="11650" w:type="dxa"/>
+        <w:shd w:val="clear" w:color="auto" w:fill="FFFFFF"/>
+        <w:tblCellMar>
+          <w:top w:w="15" w:type="dxa"/>
+          <w:left w:w="15" w:type="dxa"/>
+          <w:bottom w:w="15" w:type="dxa"/>
+          <w:right w:w="15" w:type="dxa"/>
+        </w:tblCellMar>
+        <w:tblLook w:val="04A0" w:firstRow="1" w:lastRow="0" w:firstColumn="1" w:lastColumn="0" w:noHBand="0" w:noVBand="1"/>
+      </w:tblPr>
+      <w:tblGrid>
+        <w:gridCol w:w="3052"/>
+        <w:gridCol w:w="3330"/>
+        <w:gridCol w:w="5268"/>
+      </w:tblGrid>
+      <w:tr>
+        <w:trPr>
+          <w:tblHeader/>
+        </w:trPr>
+        <w:tc>
+          <w:tcPr>
+            <w:tcW w:w="3052" w:type="dxa"/>
+            <w:tcBorders>
+              <w:top w:val="single" w:sz="6" w:space="0" w:color="FCFCFC"/>
+              <w:left w:val="single" w:sz="6" w:space="0" w:color="FCFCFC"/>
+              <w:bottom w:val="single" w:sz="6" w:space="0" w:color="FCFCFC"/>
+              <w:right w:val="single" w:sz="6" w:space="0" w:color="FCFCFC"/>
+            </w:tcBorders>
+            <w:shd w:val="clear" w:color="auto" w:fill="DADADA"/>
+            <w:tcMar>
+              <w:top w:w="120" w:type="dxa"/>
+              <w:left w:w="120" w:type="dxa"/>
+              <w:bottom w:w="120" w:type="dxa"/>
+              <w:right w:w="120" w:type="dxa"/>
+            </w:tcMar>
+            <w:vAlign w:val="center"/>
+            <w:hideMark/>
+          </w:tcPr>
+          <w:p>
+            <w:pPr>
+              <w:rPr>
+                <w:b/>
+                <w:bCs/>
+              </w:rPr>
+            </w:pPr>
+            <w:r>
+              <w:rPr>
+                <w:b/>
+                <w:bCs/>
+              </w:rPr>
+              <w:t>Case</w:t>
+            </w:r>
+          </w:p>
+        </w:tc>
+        <w:tc>
+          <w:tcPr>
+            <w:tcW w:w="3330" w:type="dxa"/>
+            <w:tcBorders>
+              <w:top w:val="single" w:sz="6" w:space="0" w:color="FCFCFC"/>
+              <w:left w:val="single" w:sz="6" w:space="0" w:color="FCFCFC"/>
+              <w:bottom w:val="single" w:sz="6" w:space="0" w:color="FCFCFC"/>
+              <w:right w:val="single" w:sz="6" w:space="0" w:color="FCFCFC"/>
+            </w:tcBorders>
+            <w:shd w:val="clear" w:color="auto" w:fill="DADADA"/>
+            <w:tcMar>
+              <w:top w:w="120" w:type="dxa"/>
+              <w:left w:w="120" w:type="dxa"/>
+              <w:bottom w:w="120" w:type="dxa"/>
+              <w:right w:w="120" w:type="dxa"/>
+            </w:tcMar>
+            <w:vAlign w:val="center"/>
+            <w:hideMark/>
+          </w:tcPr>
+          <w:p>
+            <w:pPr>
+              <w:rPr>
+                <w:b/>
+                <w:bCs/>
+              </w:rPr>
+            </w:pPr>
+            <w:r>
+              <w:rPr>
+                <w:b/>
+                <w:bCs/>
+              </w:rPr>
+              <w:t>Context Precision</w:t>
+            </w:r>
+          </w:p>
+        </w:tc>
+        <w:tc>
+          <w:tcPr>
+            <w:tcW w:w="5268" w:type="dxa"/>
+            <w:tcBorders>
+              <w:top w:val="single" w:sz="6" w:space="0" w:color="FCFCFC"/>
+              <w:left w:val="single" w:sz="6" w:space="0" w:color="FCFCFC"/>
+              <w:bottom w:val="single" w:sz="6" w:space="0" w:color="FCFCFC"/>
+              <w:right w:val="single" w:sz="6" w:space="0" w:color="FCFCFC"/>
+            </w:tcBorders>
+            <w:shd w:val="clear" w:color="auto" w:fill="DADADA"/>
+            <w:tcMar>
+              <w:top w:w="120" w:type="dxa"/>
+              <w:left w:w="120" w:type="dxa"/>
+              <w:bottom w:w="120" w:type="dxa"/>
+              <w:right w:w="120" w:type="dxa"/>
+            </w:tcMar>
+            <w:vAlign w:val="center"/>
+            <w:hideMark/>
+          </w:tcPr>
+          <w:p>
+            <w:pPr>
+              <w:rPr>
+                <w:b/>
+                <w:bCs/>
+              </w:rPr>
+            </w:pPr>
+            <w:r>
+              <w:rPr>
+                <w:b/>
+                <w:bCs/>
+              </w:rPr>
+              <w:t>Context Recall</w:t>
+            </w:r>
+          </w:p>
+        </w:tc>
+      </w:tr>
+      <w:tr>
+        <w:tc>
+          <w:tcPr>
+            <w:tcW w:w="3052" w:type="dxa"/>
+            <w:tcBorders>
+              <w:top w:val="single" w:sz="6" w:space="0" w:color="DADADA"/>
+              <w:left w:val="single" w:sz="6" w:space="0" w:color="DADADA"/>
+              <w:bottom w:val="single" w:sz="6" w:space="0" w:color="DADADA"/>
+              <w:right w:val="single" w:sz="6" w:space="0" w:color="DADADA"/>
+            </w:tcBorders>
+            <w:shd w:val="clear" w:color="auto" w:fill="FFFFFF"/>
+            <w:tcMar>
+              <w:top w:w="120" w:type="dxa"/>
+              <w:left w:w="120" w:type="dxa"/>
+              <w:bottom w:w="120" w:type="dxa"/>
+              <w:right w:w="120" w:type="dxa"/>
+            </w:tcMar>
+            <w:vAlign w:val="center"/>
+            <w:hideMark/>
+          </w:tcPr>
+          <w:p>
+            <w:r>
+              <w:t>Outstanding client items</w:t>
+            </w:r>
+          </w:p>
+        </w:tc>
+        <w:tc>
+          <w:tcPr>
+            <w:tcW w:w="3330" w:type="dxa"/>
+            <w:tcBorders>
+              <w:top w:val="single" w:sz="6" w:space="0" w:color="DADADA"/>
+              <w:left w:val="single" w:sz="6" w:space="0" w:color="DADADA"/>
+              <w:bottom w:val="single" w:sz="6" w:space="0" w:color="DADADA"/>
+              <w:right w:val="single" w:sz="6" w:space="0" w:color="DADADA"/>
+            </w:tcBorders>
+            <w:shd w:val="clear" w:color="auto" w:fill="FFFFFF"/>
+            <w:tcMar>
+              <w:top w:w="120" w:type="dxa"/>
+              <w:left w:w="120" w:type="dxa"/>
+              <w:bottom w:w="120" w:type="dxa"/>
+              <w:right w:w="120" w:type="dxa"/>
+            </w:tcMar>
+            <w:vAlign w:val="center"/>
+            <w:hideMark/>
+          </w:tcPr>
+          <w:p>
+            <w:r>
+              <w:t>1.000</w:t>
+            </w:r>
+          </w:p>
+        </w:tc>
+        <w:tc>
+          <w:tcPr>
+            <w:tcW w:w="5268" w:type="dxa"/>
+            <w:tcBorders>
+              <w:top w:val="single" w:sz="6" w:space="0" w:color="DADADA"/>
+              <w:left w:val="single" w:sz="6" w:space="0" w:color="DADADA"/>
+              <w:bottom w:val="single" w:sz="6" w:space="0" w:color="DADADA"/>
+              <w:right w:val="single" w:sz="6" w:space="0" w:color="DADADA"/>
+            </w:tcBorders>
+            <w:shd w:val="clear" w:color="auto" w:fill="FFFFFF"/>
+            <w:tcMar>
+              <w:top w:w="120" w:type="dxa"/>
+              <w:left w:w="120" w:type="dxa"/>
+              <w:bottom w:w="120" w:type="dxa"/>
+              <w:right w:w="120" w:type="dxa"/>
+            </w:tcMar>
+            <w:vAlign w:val="center"/>
+            <w:hideMark/>
+          </w:tcPr>
+          <w:p>
+            <w:r>
+              <w:t>1.000</w:t>
+            </w:r>
+          </w:p>
+        </w:tc>
+      </w:tr>
+      <w:tr>
+        <w:tc>
+          <w:tcPr>
+            <w:tcW w:w="3052" w:type="dxa"/>
+            <w:tcBorders>
+              <w:top w:val="single" w:sz="6" w:space="0" w:color="DADADA"/>
+              <w:left w:val="single" w:sz="6" w:space="0" w:color="DADADA"/>
+              <w:bottom w:val="single" w:sz="6" w:space="0" w:color="DADADA"/>
+              <w:right w:val="single" w:sz="6" w:space="0" w:color="DADADA"/>
+            </w:tcBorders>
+            <w:shd w:val="clear" w:color="auto" w:fill="FFFFFF"/>
+            <w:tcMar>
+              <w:top w:w="120" w:type="dxa"/>
+              <w:left w:w="120" w:type="dxa"/>
+              <w:bottom w:w="120" w:type="dxa"/>
+              <w:right w:w="120" w:type="dxa"/>
+            </w:tcMar>
+            <w:vAlign w:val="center"/>
+            <w:hideMark/>
+          </w:tcPr>
+          <w:p>
+            <w:r>
+              <w:t>Client background summary</w:t>
+            </w:r>
+          </w:p>
+        </w:tc>
+        <w:tc>
+          <w:tcPr>
+            <w:tcW w:w="3330" w:type="dxa"/>
+            <w:tcBorders>
+              <w:top w:val="single" w:sz="6" w:space="0" w:color="DADADA"/>
+              <w:left w:val="single" w:sz="6" w:space="0" w:color="DADADA"/>
+              <w:bottom w:val="single" w:sz="6" w:space="0" w:color="DADADA"/>
+              <w:right w:val="single" w:sz="6" w:space="0" w:color="DADADA"/>
+            </w:tcBorders>
+            <w:shd w:val="clear" w:color="auto" w:fill="FFFFFF"/>
+            <w:tcMar>
+              <w:top w:w="120" w:type="dxa"/>
+              <w:left w:w="120" w:type="dxa"/>
+              <w:bottom w:w="120" w:type="dxa"/>
+              <w:right w:w="120" w:type="dxa"/>
+            </w:tcMar>
+            <w:vAlign w:val="center"/>
+            <w:hideMark/>
+          </w:tcPr>
+          <w:p>
+            <w:r>
+              <w:t>1.000</w:t>
+            </w:r>
+          </w:p>
+        </w:tc>
+        <w:tc>
+          <w:tcPr>
+            <w:tcW w:w="5268" w:type="dxa"/>
+            <w:tcBorders>
+              <w:top w:val="single" w:sz="6" w:space="0" w:color="DADADA"/>
+              <w:left w:val="single" w:sz="6" w:space="0" w:color="DADADA"/>
+              <w:bottom w:val="single" w:sz="6" w:space="0" w:color="DADADA"/>
+              <w:right w:val="single" w:sz="6" w:space="0" w:color="DADADA"/>
+            </w:tcBorders>
+            <w:shd w:val="clear" w:color="auto" w:fill="FFFFFF"/>
+            <w:tcMar>
+              <w:top w:w="120" w:type="dxa"/>
+              <w:left w:w="120" w:type="dxa"/>
+              <w:bottom w:w="120" w:type="dxa"/>
+              <w:right w:w="120" w:type="dxa"/>
+            </w:tcMar>
+            <w:vAlign w:val="center"/>
+            <w:hideMark/>
+          </w:tcPr>
+          <w:p>
+            <w:r>
+              <w:t>1.000</w:t>
+            </w:r>
+          </w:p>
+        </w:tc>
+      </w:tr>
+      <w:tr>
+        <w:tc>
+          <w:tcPr>
+            <w:tcW w:w="3052" w:type="dxa"/>
+            <w:tcBorders>
+              <w:top w:val="single" w:sz="6" w:space="0" w:color="DADADA"/>
+              <w:left w:val="single" w:sz="6" w:space="0" w:color="DADADA"/>
+              <w:bottom w:val="single" w:sz="6" w:space="0" w:color="DADADA"/>
+              <w:right w:val="single" w:sz="6" w:space="0" w:color="DADADA"/>
+            </w:tcBorders>
+            <w:shd w:val="clear" w:color="auto" w:fill="FFFFFF"/>
+            <w:tcMar>
+              <w:top w:w="120" w:type="dxa"/>
+              <w:left w:w="120" w:type="dxa"/>
+              <w:bottom w:w="120" w:type="dxa"/>
+              <w:right w:w="120" w:type="dxa"/>
+            </w:tcMar>
+            <w:vAlign w:val="center"/>
+            <w:hideMark/>
+          </w:tcPr>
+          <w:p>
+            <w:r>
+              <w:t>Control and audit risk areas</w:t>
+            </w:r>
+          </w:p>
+        </w:tc>
+        <w:tc>
+          <w:tcPr>
+            <w:tcW w:w="3330" w:type="dxa"/>
+            <w:tcBorders>
+              <w:top w:val="single" w:sz="6" w:space="0" w:color="DADADA"/>
+              <w:left w:val="single" w:sz="6" w:space="0" w:color="DADADA"/>
+              <w:bottom w:val="single" w:sz="6" w:space="0" w:color="DADADA"/>
+              <w:right w:val="single" w:sz="6" w:space="0" w:color="DADADA"/>
+            </w:tcBorders>
+            <w:shd w:val="clear" w:color="auto" w:fill="FFFFFF"/>
+            <w:tcMar>
+              <w:top w:w="120" w:type="dxa"/>
+              <w:left w:w="120" w:type="dxa"/>
+              <w:bottom w:w="120" w:type="dxa"/>
+              <w:right w:w="120" w:type="dxa"/>
+            </w:tcMar>
+            <w:vAlign w:val="center"/>
+            <w:hideMark/>
+          </w:tcPr>
+          <w:p>
+            <w:r>
+              <w:t>0.806</w:t>
+            </w:r>
+          </w:p>
+        </w:tc>
+        <w:tc>
+          <w:tcPr>
+            <w:tcW w:w="5268" w:type="dxa"/>
+            <w:tcBorders>
+              <w:top w:val="single" w:sz="6" w:space="0" w:color="DADADA"/>
+              <w:left w:val="single" w:sz="6" w:space="0" w:color="DADADA"/>
+              <w:bottom w:val="single" w:sz="6" w:space="0" w:color="DADADA"/>
+              <w:right w:val="single" w:sz="6" w:space="0" w:color="DADADA"/>
+            </w:tcBorders>
+            <w:shd w:val="clear" w:color="auto" w:fill="FFFFFF"/>
+            <w:tcMar>
+              <w:top w:w="120" w:type="dxa"/>
+              <w:left w:w="120" w:type="dxa"/>
+              <w:bottom w:w="120" w:type="dxa"/>
+              <w:right w:w="120" w:type="dxa"/>
+            </w:tcMar>
+            <w:vAlign w:val="center"/>
+            <w:hideMark/>
+          </w:tcPr>
+          <w:p>
+            <w:r>
+              <w:t>1.000</w:t>
+            </w:r>
+          </w:p>
+        </w:tc>
+      </w:tr>
+      <w:tr>
+        <w:tc>
+          <w:tcPr>
+            <w:tcW w:w="3052" w:type="dxa"/>
+            <w:tcBorders>
+              <w:top w:val="single" w:sz="6" w:space="0" w:color="DADADA"/>
+              <w:left w:val="single" w:sz="6" w:space="0" w:color="DADADA"/>
+              <w:bottom w:val="single" w:sz="6" w:space="0" w:color="DADADA"/>
+              <w:right w:val="single" w:sz="6" w:space="0" w:color="DADADA"/>
+            </w:tcBorders>
+            <w:shd w:val="clear" w:color="auto" w:fill="FFFFFF"/>
+            <w:tcMar>
+              <w:top w:w="120" w:type="dxa"/>
+              <w:left w:w="120" w:type="dxa"/>
+              <w:bottom w:w="120" w:type="dxa"/>
+              <w:right w:w="120" w:type="dxa"/>
+            </w:tcMar>
+            <w:vAlign w:val="center"/>
+            <w:hideMark/>
+          </w:tcPr>
+          <w:p>
+            <w:r>
+              <w:t>Manual journal entry follow-up</w:t>
+            </w:r>
+          </w:p>
+        </w:tc>
+        <w:tc>
+          <w:tcPr>
+            <w:tcW w:w="3330" w:type="dxa"/>
+            <w:tcBorders>
+              <w:top w:val="single" w:sz="6" w:space="0" w:color="DADADA"/>
+              <w:left w:val="single" w:sz="6" w:space="0" w:color="DADADA"/>
+              <w:bottom w:val="single" w:sz="6" w:space="0" w:color="DADADA"/>
+              <w:right w:val="single" w:sz="6" w:space="0" w:color="DADADA"/>
+            </w:tcBorders>
+            <w:shd w:val="clear" w:color="auto" w:fill="FFFFFF"/>
+            <w:tcMar>
+              <w:top w:w="120" w:type="dxa"/>
+              <w:left w:w="120" w:type="dxa"/>
+              <w:bottom w:w="120" w:type="dxa"/>
+              <w:right w:w="120" w:type="dxa"/>
+            </w:tcMar>
+            <w:vAlign w:val="center"/>
+            <w:hideMark/>
+          </w:tcPr>
+          <w:p>
+            <w:r>
+              <w:t>1.000</w:t>
+            </w:r>
+          </w:p>
+        </w:tc>
+        <w:tc>
+          <w:tcPr>
+            <w:tcW w:w="5268" w:type="dxa"/>
+            <w:tcBorders>
+              <w:top w:val="single" w:sz="6" w:space="0" w:color="DADADA"/>
+              <w:left w:val="single" w:sz="6" w:space="0" w:color="DADADA"/>
+              <w:bottom w:val="single" w:sz="6" w:space="0" w:color="DADADA"/>
+              <w:right w:val="single" w:sz="6" w:space="0" w:color="DADADA"/>
+            </w:tcBorders>
+            <w:shd w:val="clear" w:color="auto" w:fill="FFFFFF"/>
+            <w:tcMar>
+              <w:top w:w="120" w:type="dxa"/>
+              <w:left w:w="120" w:type="dxa"/>
+              <w:bottom w:w="120" w:type="dxa"/>
+              <w:right w:w="120" w:type="dxa"/>
+            </w:tcMar>
+            <w:vAlign w:val="center"/>
+            <w:hideMark/>
+          </w:tcPr>
+          <w:p>
+            <w:r>
+              <w:t>1.000</w:t>
+            </w:r>
+          </w:p>
+        </w:tc>
+      </w:tr>
+      <w:tr>
+        <w:tc>
+          <w:tcPr>
+            <w:tcW w:w="3052" w:type="dxa"/>
+            <w:tcBorders>
+              <w:top w:val="single" w:sz="6" w:space="0" w:color="DADADA"/>
+              <w:left w:val="single" w:sz="6" w:space="0" w:color="DADADA"/>
+              <w:bottom w:val="single" w:sz="6" w:space="0" w:color="DADADA"/>
+              <w:right w:val="single" w:sz="6" w:space="0" w:color="DADADA"/>
+            </w:tcBorders>
+            <w:shd w:val="clear" w:color="auto" w:fill="FFFFFF"/>
+            <w:tcMar>
+              <w:top w:w="120" w:type="dxa"/>
+              <w:left w:w="120" w:type="dxa"/>
+              <w:bottom w:w="120" w:type="dxa"/>
+              <w:right w:w="120" w:type="dxa"/>
+            </w:tcMar>
+            <w:vAlign w:val="center"/>
+            <w:hideMark/>
+          </w:tcPr>
+          <w:p>
+            <w:r>
+              <w:t>Audit planning memo</w:t>
+            </w:r>
+          </w:p>
+        </w:tc>
+        <w:tc>
+          <w:tcPr>
+            <w:tcW w:w="3330" w:type="dxa"/>
+            <w:tcBorders>
+              <w:top w:val="single" w:sz="6" w:space="0" w:color="DADADA"/>
+              <w:left w:val="single" w:sz="6" w:space="0" w:color="DADADA"/>
+              <w:bottom w:val="single" w:sz="6" w:space="0" w:color="DADADA"/>
+              <w:right w:val="single" w:sz="6" w:space="0" w:color="DADADA"/>
+            </w:tcBorders>
+            <w:shd w:val="clear" w:color="auto" w:fill="FFFFFF"/>
+            <w:tcMar>
+              <w:top w:w="120" w:type="dxa"/>
+              <w:left w:w="120" w:type="dxa"/>
+              <w:bottom w:w="120" w:type="dxa"/>
+              <w:right w:w="120" w:type="dxa"/>
+            </w:tcMar>
+            <w:vAlign w:val="center"/>
+            <w:hideMark/>
+          </w:tcPr>
+          <w:p>
+            <w:r>
+              <w:t>0.806</w:t>
+            </w:r>
+          </w:p>
+        </w:tc>
+        <w:tc>
+          <w:tcPr>
+            <w:tcW w:w="5268" w:type="dxa"/>
+            <w:tcBorders>
+              <w:top w:val="single" w:sz="6" w:space="0" w:color="DADADA"/>
+              <w:left w:val="single" w:sz="6" w:space="0" w:color="DADADA"/>
+              <w:bottom w:val="single" w:sz="6" w:space="0" w:color="DADADA"/>
+              <w:right w:val="single" w:sz="6" w:space="0" w:color="DADADA"/>
+            </w:tcBorders>
+            <w:shd w:val="clear" w:color="auto" w:fill="FFFFFF"/>
+            <w:tcMar>
+              <w:top w:w="120" w:type="dxa"/>
+              <w:left w:w="120" w:type="dxa"/>
+              <w:bottom w:w="120" w:type="dxa"/>
+              <w:right w:w="120" w:type="dxa"/>
+            </w:tcMar>
+            <w:vAlign w:val="center"/>
+            <w:hideMark/>
+          </w:tcPr>
+          <w:p>
+            <w:r>
+              <w:t>1.000</w:t>
+            </w:r>
+          </w:p>
+        </w:tc>
+      </w:tr>
+    </w:tbl>
+    <w:p/>
+    <w:p>
+      <w:pPr>
+        <w:rPr>
+          <w:b/>
+          <w:bCs/>
+        </w:rPr>
+      </w:pPr>
+      <w:r>
+        <w:rPr>
+          <w:b/>
+          <w:bCs/>
+        </w:rPr>
+        <w:t>Deep analysis of the results</w:t>
+      </w:r>
+    </w:p>
+    <w:p>
+      <w:r>
+        <w:t>These results show a very clear and meaningful tradeoff.</w:t>
+      </w:r>
+    </w:p>
+    <w:p>
+      <w:r>
+        <w:t>The baseline similarity retriever was better at keeping the evidence set extremely focused. That is why it achieved a perfect 1.00 precision score. However, its lower 0.80 recall suggests that in at least some cases it was not bringing in enough supporting evidence to fully cover the answer. In other words, it was very precise, but sometimes too narrow.</w:t>
+      </w:r>
+    </w:p>
+    <w:p>
+      <w:r>
+        <w:t xml:space="preserve">The MMR retriever improved recall from 0.80 to 1.00, which is a substantial gain. This means that under the MMR setup, the retrieved evidence was sufficient to fully cover the reference information across all evaluation cases. That is a very important result for this project, because many audit-style tasks depend on combining facts across multiple documents rather than retrieving a single isolated passage. In that sense, MMR successfully solved the exact problem it was meant to </w:t>
+      </w:r>
+      <w:r>
+        <w:t>address</w:t>
+      </w:r>
+      <w:r>
+        <w:t xml:space="preserve"> coverage for multi-source reasoning.</w:t>
+      </w:r>
+    </w:p>
+    <w:p/>
+    <w:p>
+      <w:r>
+        <w:lastRenderedPageBreak/>
+        <w:t>At the same time, precision fell from 1.00 to 0.922, which means the evidence set became somewhat noisier. This is not surprising. MMR works by intentionally broadening the retrieval set so that it includes more diverse chunks. In practice, that means the retriever is less likely to return five near-duplicate chunks from the same source, but more likely to include one or two chunks that are useful for completeness while being slightly less central to the prompt. That is exactly the tradeoff visible in the results.</w:t>
+      </w:r>
+    </w:p>
+    <w:p>
+      <w:r>
+        <w:br/>
+      </w:r>
     </w:p>
     <w:p>
       <w:pPr>
@@ -1554,44 +4585,104 @@
     </w:p>
     <w:p>
       <w:r>
+        <w:t>4. add report export options beyond markdown,</w:t>
+      </w:r>
+    </w:p>
+    <w:p>
+      <w:r>
+        <w:t>5. improve retrieval evaluation and document traceability,</w:t>
+      </w:r>
+    </w:p>
+    <w:p>
+      <w:r>
+        <w:t>6. expand to additional workflow types such as client letters and issues checklists,</w:t>
+      </w:r>
+    </w:p>
+    <w:p>
+      <w:r>
+        <w:t>7. later explore connector-style or MCP-backed source integration.</w:t>
+      </w:r>
+    </w:p>
+    <w:p/>
+    <w:p>
+      <w:pPr>
+        <w:rPr>
+          <w:b/>
+          <w:bCs/>
+        </w:rPr>
+      </w:pPr>
+      <w:r>
+        <w:rPr>
+          <w:b/>
+          <w:bCs/>
+        </w:rPr>
+        <w:t>Longer-term vision</w:t>
+      </w:r>
+    </w:p>
+    <w:p>
+      <w:r>
+        <w:t xml:space="preserve">The longer-term direction is to evolve </w:t>
+      </w:r>
+      <w:proofErr w:type="spellStart"/>
+      <w:r>
+        <w:t>SwarmMate</w:t>
+      </w:r>
+      <w:proofErr w:type="spellEnd"/>
+      <w:r>
+        <w:t xml:space="preserve"> into a domain-specific coworker for accounting teams that </w:t>
+      </w:r>
+      <w:proofErr w:type="gramStart"/>
+      <w:r>
+        <w:t>sits</w:t>
+      </w:r>
+      <w:proofErr w:type="gramEnd"/>
+      <w:r>
+        <w:t xml:space="preserve"> before legacy systems and </w:t>
+      </w:r>
+      <w:proofErr w:type="gramStart"/>
+      <w:r>
+        <w:t>helps</w:t>
+      </w:r>
+      <w:proofErr w:type="gramEnd"/>
+      <w:r>
+        <w:t xml:space="preserve"> produce grounded, review-ready artifacts. Rather than replacing systems like CCH, it improves the messy human workflow that happens before final data entry and formal review.</w:t>
+      </w:r>
+    </w:p>
+    <w:p/>
+    <w:p/>
+    <w:p/>
+    <w:p/>
+    <w:p/>
+    <w:p>
+      <w:pPr>
+        <w:rPr>
+          <w:b/>
+          <w:bCs/>
+        </w:rPr>
+      </w:pPr>
+      <w:r>
+        <w:rPr>
+          <w:b/>
+          <w:bCs/>
+        </w:rPr>
         <w:lastRenderedPageBreak/>
-        <w:t>4. add report export options beyond markdown,</w:t>
-      </w:r>
-    </w:p>
-    <w:p>
-      <w:r>
-        <w:t>5. improve retrieval evaluation and document traceability,</w:t>
-      </w:r>
-    </w:p>
-    <w:p>
-      <w:r>
-        <w:t>6. expand to additional workflow types such as client letters and issues checklists,</w:t>
-      </w:r>
-    </w:p>
-    <w:p>
-      <w:r>
-        <w:t>7. later explore connector-style or MCP-backed source integration.</w:t>
+        <w:t>Summary</w:t>
+      </w:r>
+    </w:p>
+    <w:p>
+      <w:proofErr w:type="spellStart"/>
+      <w:r>
+        <w:t>SwarmMate</w:t>
+      </w:r>
+      <w:proofErr w:type="spellEnd"/>
+      <w:r>
+        <w:t xml:space="preserve"> Audit Workpaper Adapter is a workflow-first AI assistant designed to help audit and tax teams turn fragmented client workpapers into grounded, review-ready outputs. The project was shaped by a real conversation with Steven Weging, IT Director at CDH, who highlighted a practical problem faced by small accounting firms: generic AI tools can be useful, but they often create “AI slop” — low-quality outputs that coworkers must clean up, verify, or rewrite. This problem is made worse by legacy accounting environments such as CCH and Thomson Reuters, where deep integration is expensive, limited, and often unrealistic for smaller firms. Instead of building a one-size-fits-all AI coworker, this project focuses on the messy work that happens before those systems: reviewing workpapers, identifying risks, tracking open requests, and drafting structured planning artifacts.</w:t>
       </w:r>
     </w:p>
     <w:p/>
     <w:p>
-      <w:pPr>
-        <w:rPr>
-          <w:b/>
-          <w:bCs/>
-        </w:rPr>
-      </w:pPr>
-      <w:r>
-        <w:rPr>
-          <w:b/>
-          <w:bCs/>
-        </w:rPr>
-        <w:t>Longer-term vision</w:t>
-      </w:r>
-    </w:p>
-    <w:p>
-      <w:r>
-        <w:t xml:space="preserve">The longer-term direction is to evolve </w:t>
+      <w:r>
+        <w:t xml:space="preserve">To address that problem, </w:t>
       </w:r>
       <w:proofErr w:type="spellStart"/>
       <w:r>
@@ -1599,73 +4690,70 @@
       </w:r>
       <w:proofErr w:type="spellEnd"/>
       <w:r>
-        <w:t xml:space="preserve"> into a domain-specific coworker for accounting teams that </w:t>
+        <w:t xml:space="preserve"> uses an agentic RAG workflow built with </w:t>
+      </w:r>
+      <w:proofErr w:type="spellStart"/>
+      <w:r>
+        <w:t>LangGraph</w:t>
+      </w:r>
+      <w:proofErr w:type="spellEnd"/>
+      <w:r>
+        <w:t xml:space="preserve"> and exposed through a simple </w:t>
+      </w:r>
+      <w:proofErr w:type="spellStart"/>
+      <w:r>
+        <w:t>Gradio</w:t>
+      </w:r>
+      <w:proofErr w:type="spellEnd"/>
+      <w:r>
+        <w:t xml:space="preserve"> interface. The workflow follows five stages: plan, retrieve, draft, review, and finalize. Users can provide workpaper-style source files and ask for </w:t>
       </w:r>
       <w:proofErr w:type="gramStart"/>
       <w:r>
-        <w:t>sits</w:t>
+        <w:t>outputs</w:t>
       </w:r>
       <w:proofErr w:type="gramEnd"/>
       <w:r>
-        <w:t xml:space="preserve"> before legacy systems and </w:t>
-      </w:r>
-      <w:proofErr w:type="gramStart"/>
-      <w:r>
-        <w:t>helps</w:t>
-      </w:r>
-      <w:proofErr w:type="gramEnd"/>
-      <w:r>
-        <w:t xml:space="preserve"> produce grounded, review-ready artifacts. Rather than replacing systems like CCH, it improves the messy human workflow that happens before final data entry and formal review.</w:t>
+        <w:t xml:space="preserve"> such as audit planning memos, workpaper summaries, issues checklists, client letters, or cited answers. The system retrieves evidence from the source corpus, generates a structured artifact with citations, applies a quality gate, and saves the result as a reusable report. This makes the experience feel less like chatting with a generic LLM and more like using a focused workflow adapter designed for a real accounting use case.</w:t>
       </w:r>
     </w:p>
     <w:p/>
     <w:p>
-      <w:pPr>
-        <w:rPr>
-          <w:b/>
-          <w:bCs/>
-        </w:rPr>
-      </w:pPr>
-      <w:r>
-        <w:rPr>
-          <w:b/>
-          <w:bCs/>
-        </w:rPr>
-        <w:t>Summary</w:t>
-      </w:r>
-    </w:p>
-    <w:p>
-      <w:r>
-        <w:rPr>
-          <w:b/>
-          <w:bCs/>
-        </w:rPr>
-        <w:t>Swarm Mate</w:t>
-      </w:r>
-      <w:r>
-        <w:rPr>
-          <w:b/>
-          <w:bCs/>
-        </w:rPr>
-        <w:t xml:space="preserve"> Audit Workpaper Adapter</w:t>
-      </w:r>
-      <w:r>
-        <w:t xml:space="preserve"> is a focused pilot for a real business problem: audit teams waste time turning fragmented client workpapers into structured outputs, while generic AI tools often create ungrounded drafts. This project demonstrates that an </w:t>
-      </w:r>
-      <w:proofErr w:type="gramStart"/>
-      <w:r>
-        <w:t>agentic</w:t>
-      </w:r>
-      <w:proofErr w:type="gramEnd"/>
-      <w:r>
-        <w:t xml:space="preserve"> RAG workflow can act as a reliable workflow adapter by planning tasks, retrieving evidence, generating cited artifacts, and saving reusable reports. The prototype is already functional, and the next milestone is to formalize the evaluation baseline and retriever improvement story for the certification challenge.</w:t>
+      <w:r>
+        <w:t xml:space="preserve">The evaluation results show that the baseline retriever is already strong for an MVP. Using a synthetic audit-style evaluation set and Ragas-based retrieval metrics, the baseline achieved very high context precision and strong context recall, showing that the system retrieves highly relevant evidence and generally covers the information needed to answer audit questions. I then implemented an MMR-based retriever upgrade to test whether more diverse retrieval could improve multi-source evidence coverage. The results showed a meaningful tradeoff: MMR improved recall from 0.80 to 1.00, but reduced precision from 1.00 to 0.922. This suggests that MMR is better for synthesis-heavy tasks like planning memos and risk summaries, while standard similarity retrieval remains better for narrow fact-based Q&amp;A. Based on that comparison, the strongest conclusion is that </w:t>
+      </w:r>
+      <w:proofErr w:type="spellStart"/>
+      <w:r>
+        <w:t>SwarmMate</w:t>
+      </w:r>
+      <w:proofErr w:type="spellEnd"/>
+      <w:r>
+        <w:t xml:space="preserve"> benefits from a task-sensitive retrieval strategy rather than a one-size-fits-all retriever.</w:t>
+      </w:r>
+    </w:p>
+    <w:p/>
+    <w:p>
+      <w:r>
+        <w:t xml:space="preserve">Overall, this project demonstrates that the real opportunity for small firms like CDH is not a generic AI coworker, but a custom workflow tool that fits existing processes, reduces AI </w:t>
+      </w:r>
+      <w:r>
+        <w:lastRenderedPageBreak/>
+        <w:t xml:space="preserve">slop, and produces grounded, structured artifacts. </w:t>
+      </w:r>
+      <w:proofErr w:type="spellStart"/>
+      <w:r>
+        <w:t>SwarmMate</w:t>
+      </w:r>
+      <w:proofErr w:type="spellEnd"/>
+      <w:r>
+        <w:t xml:space="preserve"> shows that even without deep legacy-system integration, an agentic RAG workflow can add meaningful business value by helping teams move from messy client documents to trustworthy, review-ready outputs.</w:t>
       </w:r>
     </w:p>
     <w:p/>
     <w:sectPr>
-      <w:footerReference w:type="even" r:id="rId9"/>
-      <w:footerReference w:type="default" r:id="rId10"/>
-      <w:footerReference w:type="first" r:id="rId11"/>
+      <w:footerReference w:type="even" r:id="rId10"/>
+      <w:footerReference w:type="default" r:id="rId11"/>
+      <w:footerReference w:type="first" r:id="rId12"/>
       <w:pgSz w:w="12240" w:h="15840"/>
       <w:pgMar w:top="1440" w:right="1440" w:bottom="1440" w:left="1440" w:header="720" w:footer="720" w:gutter="0"/>
       <w:cols w:space="720"/>
@@ -2830,6 +5918,95 @@
     </w:lvl>
   </w:abstractNum>
   <w:abstractNum w:abstractNumId="8" w15:restartNumberingAfterBreak="0">
+    <w:nsid w:val="4D1033A5"/>
+    <w:multiLevelType w:val="hybridMultilevel"/>
+    <w:tmpl w:val="AC907DFA"/>
+    <w:lvl w:ilvl="0" w:tplc="56C42EB2">
+      <w:start w:val="1"/>
+      <w:numFmt w:val="decimal"/>
+      <w:lvlText w:val="%1."/>
+      <w:lvlJc w:val="left"/>
+      <w:pPr>
+        <w:ind w:left="1080" w:hanging="360"/>
+      </w:pPr>
+      <w:rPr>
+        <w:rFonts w:hint="default"/>
+      </w:rPr>
+    </w:lvl>
+    <w:lvl w:ilvl="1" w:tplc="04090019">
+      <w:start w:val="1"/>
+      <w:numFmt w:val="lowerLetter"/>
+      <w:lvlText w:val="%2."/>
+      <w:lvlJc w:val="left"/>
+      <w:pPr>
+        <w:ind w:left="1800" w:hanging="360"/>
+      </w:pPr>
+    </w:lvl>
+    <w:lvl w:ilvl="2" w:tplc="0409001B" w:tentative="1">
+      <w:start w:val="1"/>
+      <w:numFmt w:val="lowerRoman"/>
+      <w:lvlText w:val="%3."/>
+      <w:lvlJc w:val="right"/>
+      <w:pPr>
+        <w:ind w:left="2520" w:hanging="180"/>
+      </w:pPr>
+    </w:lvl>
+    <w:lvl w:ilvl="3" w:tplc="0409000F" w:tentative="1">
+      <w:start w:val="1"/>
+      <w:numFmt w:val="decimal"/>
+      <w:lvlText w:val="%4."/>
+      <w:lvlJc w:val="left"/>
+      <w:pPr>
+        <w:ind w:left="3240" w:hanging="360"/>
+      </w:pPr>
+    </w:lvl>
+    <w:lvl w:ilvl="4" w:tplc="04090019" w:tentative="1">
+      <w:start w:val="1"/>
+      <w:numFmt w:val="lowerLetter"/>
+      <w:lvlText w:val="%5."/>
+      <w:lvlJc w:val="left"/>
+      <w:pPr>
+        <w:ind w:left="3960" w:hanging="360"/>
+      </w:pPr>
+    </w:lvl>
+    <w:lvl w:ilvl="5" w:tplc="0409001B" w:tentative="1">
+      <w:start w:val="1"/>
+      <w:numFmt w:val="lowerRoman"/>
+      <w:lvlText w:val="%6."/>
+      <w:lvlJc w:val="right"/>
+      <w:pPr>
+        <w:ind w:left="4680" w:hanging="180"/>
+      </w:pPr>
+    </w:lvl>
+    <w:lvl w:ilvl="6" w:tplc="0409000F" w:tentative="1">
+      <w:start w:val="1"/>
+      <w:numFmt w:val="decimal"/>
+      <w:lvlText w:val="%7."/>
+      <w:lvlJc w:val="left"/>
+      <w:pPr>
+        <w:ind w:left="5400" w:hanging="360"/>
+      </w:pPr>
+    </w:lvl>
+    <w:lvl w:ilvl="7" w:tplc="04090019" w:tentative="1">
+      <w:start w:val="1"/>
+      <w:numFmt w:val="lowerLetter"/>
+      <w:lvlText w:val="%8."/>
+      <w:lvlJc w:val="left"/>
+      <w:pPr>
+        <w:ind w:left="6120" w:hanging="360"/>
+      </w:pPr>
+    </w:lvl>
+    <w:lvl w:ilvl="8" w:tplc="0409001B" w:tentative="1">
+      <w:start w:val="1"/>
+      <w:numFmt w:val="lowerRoman"/>
+      <w:lvlText w:val="%9."/>
+      <w:lvlJc w:val="right"/>
+      <w:pPr>
+        <w:ind w:left="6840" w:hanging="180"/>
+      </w:pPr>
+    </w:lvl>
+  </w:abstractNum>
+  <w:abstractNum w:abstractNumId="9" w15:restartNumberingAfterBreak="0">
     <w:nsid w:val="535060B2"/>
     <w:multiLevelType w:val="hybridMultilevel"/>
     <w:tmpl w:val="594404A4"/>
@@ -2918,7 +6095,7 @@
       </w:pPr>
     </w:lvl>
   </w:abstractNum>
-  <w:abstractNum w:abstractNumId="9" w15:restartNumberingAfterBreak="0">
+  <w:abstractNum w:abstractNumId="10" w15:restartNumberingAfterBreak="0">
     <w:nsid w:val="57755BAD"/>
     <w:multiLevelType w:val="hybridMultilevel"/>
     <w:tmpl w:val="A43ADD40"/>
@@ -3004,7 +6181,120 @@
       </w:pPr>
     </w:lvl>
   </w:abstractNum>
-  <w:abstractNum w:abstractNumId="10" w15:restartNumberingAfterBreak="0">
+  <w:abstractNum w:abstractNumId="11" w15:restartNumberingAfterBreak="0">
+    <w:nsid w:val="5EF47F48"/>
+    <w:multiLevelType w:val="hybridMultilevel"/>
+    <w:tmpl w:val="89340D48"/>
+    <w:lvl w:ilvl="0" w:tplc="04090001">
+      <w:start w:val="1"/>
+      <w:numFmt w:val="bullet"/>
+      <w:lvlText w:val=""/>
+      <w:lvlJc w:val="left"/>
+      <w:pPr>
+        <w:ind w:left="720" w:hanging="360"/>
+      </w:pPr>
+      <w:rPr>
+        <w:rFonts w:ascii="Symbol" w:hAnsi="Symbol" w:hint="default"/>
+      </w:rPr>
+    </w:lvl>
+    <w:lvl w:ilvl="1" w:tplc="04090003" w:tentative="1">
+      <w:start w:val="1"/>
+      <w:numFmt w:val="bullet"/>
+      <w:lvlText w:val="o"/>
+      <w:lvlJc w:val="left"/>
+      <w:pPr>
+        <w:ind w:left="1440" w:hanging="360"/>
+      </w:pPr>
+      <w:rPr>
+        <w:rFonts w:ascii="Courier New" w:hAnsi="Courier New" w:cs="Courier New" w:hint="default"/>
+      </w:rPr>
+    </w:lvl>
+    <w:lvl w:ilvl="2" w:tplc="04090005" w:tentative="1">
+      <w:start w:val="1"/>
+      <w:numFmt w:val="bullet"/>
+      <w:lvlText w:val=""/>
+      <w:lvlJc w:val="left"/>
+      <w:pPr>
+        <w:ind w:left="2160" w:hanging="360"/>
+      </w:pPr>
+      <w:rPr>
+        <w:rFonts w:ascii="Wingdings" w:hAnsi="Wingdings" w:hint="default"/>
+      </w:rPr>
+    </w:lvl>
+    <w:lvl w:ilvl="3" w:tplc="04090001" w:tentative="1">
+      <w:start w:val="1"/>
+      <w:numFmt w:val="bullet"/>
+      <w:lvlText w:val=""/>
+      <w:lvlJc w:val="left"/>
+      <w:pPr>
+        <w:ind w:left="2880" w:hanging="360"/>
+      </w:pPr>
+      <w:rPr>
+        <w:rFonts w:ascii="Symbol" w:hAnsi="Symbol" w:hint="default"/>
+      </w:rPr>
+    </w:lvl>
+    <w:lvl w:ilvl="4" w:tplc="04090003" w:tentative="1">
+      <w:start w:val="1"/>
+      <w:numFmt w:val="bullet"/>
+      <w:lvlText w:val="o"/>
+      <w:lvlJc w:val="left"/>
+      <w:pPr>
+        <w:ind w:left="3600" w:hanging="360"/>
+      </w:pPr>
+      <w:rPr>
+        <w:rFonts w:ascii="Courier New" w:hAnsi="Courier New" w:cs="Courier New" w:hint="default"/>
+      </w:rPr>
+    </w:lvl>
+    <w:lvl w:ilvl="5" w:tplc="04090005" w:tentative="1">
+      <w:start w:val="1"/>
+      <w:numFmt w:val="bullet"/>
+      <w:lvlText w:val=""/>
+      <w:lvlJc w:val="left"/>
+      <w:pPr>
+        <w:ind w:left="4320" w:hanging="360"/>
+      </w:pPr>
+      <w:rPr>
+        <w:rFonts w:ascii="Wingdings" w:hAnsi="Wingdings" w:hint="default"/>
+      </w:rPr>
+    </w:lvl>
+    <w:lvl w:ilvl="6" w:tplc="04090001" w:tentative="1">
+      <w:start w:val="1"/>
+      <w:numFmt w:val="bullet"/>
+      <w:lvlText w:val=""/>
+      <w:lvlJc w:val="left"/>
+      <w:pPr>
+        <w:ind w:left="5040" w:hanging="360"/>
+      </w:pPr>
+      <w:rPr>
+        <w:rFonts w:ascii="Symbol" w:hAnsi="Symbol" w:hint="default"/>
+      </w:rPr>
+    </w:lvl>
+    <w:lvl w:ilvl="7" w:tplc="04090003" w:tentative="1">
+      <w:start w:val="1"/>
+      <w:numFmt w:val="bullet"/>
+      <w:lvlText w:val="o"/>
+      <w:lvlJc w:val="left"/>
+      <w:pPr>
+        <w:ind w:left="5760" w:hanging="360"/>
+      </w:pPr>
+      <w:rPr>
+        <w:rFonts w:ascii="Courier New" w:hAnsi="Courier New" w:cs="Courier New" w:hint="default"/>
+      </w:rPr>
+    </w:lvl>
+    <w:lvl w:ilvl="8" w:tplc="04090005" w:tentative="1">
+      <w:start w:val="1"/>
+      <w:numFmt w:val="bullet"/>
+      <w:lvlText w:val=""/>
+      <w:lvlJc w:val="left"/>
+      <w:pPr>
+        <w:ind w:left="6480" w:hanging="360"/>
+      </w:pPr>
+      <w:rPr>
+        <w:rFonts w:ascii="Wingdings" w:hAnsi="Wingdings" w:hint="default"/>
+      </w:rPr>
+    </w:lvl>
+  </w:abstractNum>
+  <w:abstractNum w:abstractNumId="12" w15:restartNumberingAfterBreak="0">
     <w:nsid w:val="61222917"/>
     <w:multiLevelType w:val="hybridMultilevel"/>
     <w:tmpl w:val="D41266B2"/>
@@ -3093,7 +6383,7 @@
       </w:pPr>
     </w:lvl>
   </w:abstractNum>
-  <w:abstractNum w:abstractNumId="11" w15:restartNumberingAfterBreak="0">
+  <w:abstractNum w:abstractNumId="13" w15:restartNumberingAfterBreak="0">
     <w:nsid w:val="66C61180"/>
     <w:multiLevelType w:val="hybridMultilevel"/>
     <w:tmpl w:val="20280AB8"/>
@@ -3182,7 +6472,7 @@
       </w:pPr>
     </w:lvl>
   </w:abstractNum>
-  <w:abstractNum w:abstractNumId="12" w15:restartNumberingAfterBreak="0">
+  <w:abstractNum w:abstractNumId="14" w15:restartNumberingAfterBreak="0">
     <w:nsid w:val="72C2437E"/>
     <w:multiLevelType w:val="hybridMultilevel"/>
     <w:tmpl w:val="B7A0090E"/>
@@ -3271,7 +6561,7 @@
       </w:pPr>
     </w:lvl>
   </w:abstractNum>
-  <w:abstractNum w:abstractNumId="13" w15:restartNumberingAfterBreak="0">
+  <w:abstractNum w:abstractNumId="15" w15:restartNumberingAfterBreak="0">
     <w:nsid w:val="745111D5"/>
     <w:multiLevelType w:val="hybridMultilevel"/>
     <w:tmpl w:val="E40C5136"/>
@@ -3360,7 +6650,120 @@
       </w:pPr>
     </w:lvl>
   </w:abstractNum>
-  <w:abstractNum w:abstractNumId="14" w15:restartNumberingAfterBreak="0">
+  <w:abstractNum w:abstractNumId="16" w15:restartNumberingAfterBreak="0">
+    <w:nsid w:val="7F2D2649"/>
+    <w:multiLevelType w:val="hybridMultilevel"/>
+    <w:tmpl w:val="1250E372"/>
+    <w:lvl w:ilvl="0" w:tplc="04090001">
+      <w:start w:val="1"/>
+      <w:numFmt w:val="bullet"/>
+      <w:lvlText w:val=""/>
+      <w:lvlJc w:val="left"/>
+      <w:pPr>
+        <w:ind w:left="720" w:hanging="360"/>
+      </w:pPr>
+      <w:rPr>
+        <w:rFonts w:ascii="Symbol" w:hAnsi="Symbol" w:hint="default"/>
+      </w:rPr>
+    </w:lvl>
+    <w:lvl w:ilvl="1" w:tplc="04090003" w:tentative="1">
+      <w:start w:val="1"/>
+      <w:numFmt w:val="bullet"/>
+      <w:lvlText w:val="o"/>
+      <w:lvlJc w:val="left"/>
+      <w:pPr>
+        <w:ind w:left="1440" w:hanging="360"/>
+      </w:pPr>
+      <w:rPr>
+        <w:rFonts w:ascii="Courier New" w:hAnsi="Courier New" w:cs="Courier New" w:hint="default"/>
+      </w:rPr>
+    </w:lvl>
+    <w:lvl w:ilvl="2" w:tplc="04090005" w:tentative="1">
+      <w:start w:val="1"/>
+      <w:numFmt w:val="bullet"/>
+      <w:lvlText w:val=""/>
+      <w:lvlJc w:val="left"/>
+      <w:pPr>
+        <w:ind w:left="2160" w:hanging="360"/>
+      </w:pPr>
+      <w:rPr>
+        <w:rFonts w:ascii="Wingdings" w:hAnsi="Wingdings" w:hint="default"/>
+      </w:rPr>
+    </w:lvl>
+    <w:lvl w:ilvl="3" w:tplc="04090001" w:tentative="1">
+      <w:start w:val="1"/>
+      <w:numFmt w:val="bullet"/>
+      <w:lvlText w:val=""/>
+      <w:lvlJc w:val="left"/>
+      <w:pPr>
+        <w:ind w:left="2880" w:hanging="360"/>
+      </w:pPr>
+      <w:rPr>
+        <w:rFonts w:ascii="Symbol" w:hAnsi="Symbol" w:hint="default"/>
+      </w:rPr>
+    </w:lvl>
+    <w:lvl w:ilvl="4" w:tplc="04090003" w:tentative="1">
+      <w:start w:val="1"/>
+      <w:numFmt w:val="bullet"/>
+      <w:lvlText w:val="o"/>
+      <w:lvlJc w:val="left"/>
+      <w:pPr>
+        <w:ind w:left="3600" w:hanging="360"/>
+      </w:pPr>
+      <w:rPr>
+        <w:rFonts w:ascii="Courier New" w:hAnsi="Courier New" w:cs="Courier New" w:hint="default"/>
+      </w:rPr>
+    </w:lvl>
+    <w:lvl w:ilvl="5" w:tplc="04090005" w:tentative="1">
+      <w:start w:val="1"/>
+      <w:numFmt w:val="bullet"/>
+      <w:lvlText w:val=""/>
+      <w:lvlJc w:val="left"/>
+      <w:pPr>
+        <w:ind w:left="4320" w:hanging="360"/>
+      </w:pPr>
+      <w:rPr>
+        <w:rFonts w:ascii="Wingdings" w:hAnsi="Wingdings" w:hint="default"/>
+      </w:rPr>
+    </w:lvl>
+    <w:lvl w:ilvl="6" w:tplc="04090001" w:tentative="1">
+      <w:start w:val="1"/>
+      <w:numFmt w:val="bullet"/>
+      <w:lvlText w:val=""/>
+      <w:lvlJc w:val="left"/>
+      <w:pPr>
+        <w:ind w:left="5040" w:hanging="360"/>
+      </w:pPr>
+      <w:rPr>
+        <w:rFonts w:ascii="Symbol" w:hAnsi="Symbol" w:hint="default"/>
+      </w:rPr>
+    </w:lvl>
+    <w:lvl w:ilvl="7" w:tplc="04090003" w:tentative="1">
+      <w:start w:val="1"/>
+      <w:numFmt w:val="bullet"/>
+      <w:lvlText w:val="o"/>
+      <w:lvlJc w:val="left"/>
+      <w:pPr>
+        <w:ind w:left="5760" w:hanging="360"/>
+      </w:pPr>
+      <w:rPr>
+        <w:rFonts w:ascii="Courier New" w:hAnsi="Courier New" w:cs="Courier New" w:hint="default"/>
+      </w:rPr>
+    </w:lvl>
+    <w:lvl w:ilvl="8" w:tplc="04090005" w:tentative="1">
+      <w:start w:val="1"/>
+      <w:numFmt w:val="bullet"/>
+      <w:lvlText w:val=""/>
+      <w:lvlJc w:val="left"/>
+      <w:pPr>
+        <w:ind w:left="6480" w:hanging="360"/>
+      </w:pPr>
+      <w:rPr>
+        <w:rFonts w:ascii="Wingdings" w:hAnsi="Wingdings" w:hint="default"/>
+      </w:rPr>
+    </w:lvl>
+  </w:abstractNum>
+  <w:abstractNum w:abstractNumId="17" w15:restartNumberingAfterBreak="0">
     <w:nsid w:val="7F7E543E"/>
     <w:multiLevelType w:val="hybridMultilevel"/>
     <w:tmpl w:val="B48A8812"/>
@@ -3450,7 +6853,7 @@
     </w:lvl>
   </w:abstractNum>
   <w:num w:numId="1" w16cid:durableId="380448768">
-    <w:abstractNumId w:val="8"/>
+    <w:abstractNumId w:val="9"/>
   </w:num>
   <w:num w:numId="2" w16cid:durableId="133331485">
     <w:abstractNumId w:val="0"/>
@@ -3459,19 +6862,19 @@
     <w:abstractNumId w:val="6"/>
   </w:num>
   <w:num w:numId="4" w16cid:durableId="1475634829">
-    <w:abstractNumId w:val="10"/>
+    <w:abstractNumId w:val="12"/>
   </w:num>
   <w:num w:numId="5" w16cid:durableId="1379821844">
     <w:abstractNumId w:val="3"/>
   </w:num>
   <w:num w:numId="6" w16cid:durableId="1099720500">
-    <w:abstractNumId w:val="13"/>
+    <w:abstractNumId w:val="15"/>
   </w:num>
   <w:num w:numId="7" w16cid:durableId="933785211">
     <w:abstractNumId w:val="2"/>
   </w:num>
   <w:num w:numId="8" w16cid:durableId="2118325124">
-    <w:abstractNumId w:val="14"/>
+    <w:abstractNumId w:val="17"/>
   </w:num>
   <w:num w:numId="9" w16cid:durableId="528492860">
     <w:abstractNumId w:val="7"/>
@@ -3480,7 +6883,7 @@
     <w:abstractNumId w:val="1"/>
   </w:num>
   <w:num w:numId="11" w16cid:durableId="1060439810">
-    <w:abstractNumId w:val="11"/>
+    <w:abstractNumId w:val="13"/>
   </w:num>
   <w:num w:numId="12" w16cid:durableId="1101801347">
     <w:abstractNumId w:val="5"/>
@@ -3489,10 +6892,19 @@
     <w:abstractNumId w:val="4"/>
   </w:num>
   <w:num w:numId="14" w16cid:durableId="983194538">
-    <w:abstractNumId w:val="12"/>
+    <w:abstractNumId w:val="14"/>
   </w:num>
   <w:num w:numId="15" w16cid:durableId="1004164920">
-    <w:abstractNumId w:val="9"/>
+    <w:abstractNumId w:val="10"/>
+  </w:num>
+  <w:num w:numId="16" w16cid:durableId="1155027796">
+    <w:abstractNumId w:val="16"/>
+  </w:num>
+  <w:num w:numId="17" w16cid:durableId="587348209">
+    <w:abstractNumId w:val="8"/>
+  </w:num>
+  <w:num w:numId="18" w16cid:durableId="648364081">
+    <w:abstractNumId w:val="11"/>
   </w:num>
 </w:numbering>
 </file>

</xml_diff>